<commit_message>
Create Class Diagram and ER Diagram
</commit_message>
<xml_diff>
--- a/Sheheryar_SDS Document Diagram.docx
+++ b/Sheheryar_SDS Document Diagram.docx
@@ -15892,6 +15892,3035 @@
             </a:graphic>
           </wp:anchor>
         </w:drawing>
+      </w:r>
+      <w:r>
+        <w:tab/>
+      </w:r>
+      <w:r>
+        <w:tab/>
+      </w:r>
+      <w:r>
+        <w:tab/>
+      </w:r>
+      <w:r>
+        <w:tab/>
+      </w:r>
+      <w:r>
+        <w:tab/>
+      </w:r>
+      <w:r>
+        <w:tab/>
+      </w:r>
+      <w:r>
+        <w:tab/>
+      </w:r>
+      <w:r>
+        <w:tab/>
+      </w:r>
+      <w:r>
+        <w:tab/>
+      </w:r>
+      <w:r>
+        <w:tab/>
+      </w:r>
+      <w:r>
+        <w:tab/>
+      </w:r>
+      <w:r>
+        <w:tab/>
+      </w:r>
+      <w:r>
+        <w:tab/>
+      </w:r>
+      <w:r>
+        <w:tab/>
+      </w:r>
+      <w:r>
+        <w:tab/>
+      </w:r>
+      <w:r>
+        <w:tab/>
+      </w:r>
+      <w:r>
+        <w:tab/>
+      </w:r>
+      <w:r>
+        <w:tab/>
+      </w:r>
+      <w:r>
+        <w:tab/>
+      </w:r>
+      <w:r>
+        <w:tab/>
+      </w:r>
+      <w:r>
+        <w:tab/>
+      </w:r>
+      <w:r>
+        <w:tab/>
+      </w:r>
+      <w:r>
+        <w:tab/>
+      </w:r>
+      <w:r>
+        <w:tab/>
+      </w:r>
+      <w:r>
+        <w:tab/>
+      </w:r>
+      <w:r>
+        <w:tab/>
+      </w:r>
+      <w:r>
+        <w:tab/>
+      </w:r>
+      <w:r>
+        <w:tab/>
+      </w:r>
+      <w:r>
+        <w:tab/>
+      </w:r>
+      <w:r>
+        <w:tab/>
+      </w:r>
+      <w:r>
+        <w:tab/>
+      </w:r>
+      <w:r>
+        <w:tab/>
+      </w:r>
+      <w:r>
+        <w:tab/>
+      </w:r>
+      <w:r>
+        <w:tab/>
+      </w:r>
+      <w:r>
+        <w:tab/>
+      </w:r>
+      <w:r>
+        <w:tab/>
+      </w:r>
+      <w:r>
+        <w:tab/>
+      </w:r>
+      <w:r>
+        <w:tab/>
+      </w:r>
+      <w:r>
+        <w:tab/>
+      </w:r>
+      <w:r>
+        <w:tab/>
+      </w:r>
+      <w:r>
+        <w:tab/>
+      </w:r>
+      <w:r>
+        <w:tab/>
+      </w:r>
+      <w:r>
+        <w:tab/>
+      </w:r>
+      <w:r>
+        <w:tab/>
+      </w:r>
+      <w:r>
+        <w:tab/>
+      </w:r>
+      <w:r>
+        <w:tab/>
+      </w:r>
+      <w:r>
+        <w:tab/>
+      </w:r>
+      <w:r>
+        <w:tab/>
+      </w:r>
+      <w:r>
+        <w:tab/>
+      </w:r>
+      <w:r>
+        <w:tab/>
+      </w:r>
+      <w:r>
+        <w:tab/>
+      </w:r>
+      <w:r>
+        <w:tab/>
+      </w:r>
+      <w:r>
+        <w:tab/>
+      </w:r>
+      <w:r>
+        <w:tab/>
+      </w:r>
+      <w:r>
+        <w:tab/>
+      </w:r>
+      <w:r>
+        <w:tab/>
+      </w:r>
+      <w:r>
+        <w:tab/>
+      </w:r>
+      <w:r>
+        <w:tab/>
+      </w:r>
+      <w:r>
+        <w:tab/>
+      </w:r>
+      <w:r>
+        <w:tab/>
+      </w:r>
+      <w:r>
+        <w:tab/>
+      </w:r>
+      <w:r>
+        <w:tab/>
+      </w:r>
+      <w:r>
+        <w:tab/>
+      </w:r>
+      <w:r>
+        <w:tab/>
+      </w:r>
+      <w:r>
+        <w:tab/>
+      </w:r>
+      <w:r>
+        <w:tab/>
+      </w:r>
+      <w:r>
+        <w:tab/>
+      </w:r>
+      <w:r>
+        <w:tab/>
+      </w:r>
+      <w:r>
+        <w:tab/>
+      </w:r>
+      <w:r>
+        <w:tab/>
+      </w:r>
+      <w:r>
+        <w:tab/>
+      </w:r>
+      <w:r>
+        <w:tab/>
+      </w:r>
+      <w:r>
+        <w:tab/>
+      </w:r>
+      <w:r>
+        <w:tab/>
+      </w:r>
+      <w:r>
+        <w:tab/>
+      </w:r>
+      <w:r>
+        <w:tab/>
+      </w:r>
+      <w:r>
+        <w:tab/>
+      </w:r>
+      <w:r>
+        <w:tab/>
+      </w:r>
+      <w:r>
+        <w:tab/>
+      </w:r>
+      <w:r>
+        <w:tab/>
+      </w:r>
+      <w:r>
+        <w:tab/>
+      </w:r>
+      <w:r>
+        <w:tab/>
+      </w:r>
+      <w:r>
+        <w:tab/>
+      </w:r>
+      <w:r>
+        <w:tab/>
+      </w:r>
+      <w:r>
+        <w:tab/>
+      </w:r>
+      <w:r>
+        <w:tab/>
+      </w:r>
+      <w:r>
+        <w:tab/>
+      </w:r>
+      <w:r>
+        <w:tab/>
+      </w:r>
+      <w:r>
+        <w:tab/>
+      </w:r>
+      <w:r>
+        <w:tab/>
+      </w:r>
+      <w:r>
+        <w:tab/>
+      </w:r>
+      <w:r>
+        <w:tab/>
+      </w:r>
+      <w:r>
+        <w:tab/>
+      </w:r>
+      <w:r>
+        <w:tab/>
+      </w:r>
+      <w:r>
+        <w:tab/>
+      </w:r>
+      <w:r>
+        <w:tab/>
+      </w:r>
+      <w:r>
+        <w:tab/>
+      </w:r>
+      <w:r>
+        <w:tab/>
+      </w:r>
+      <w:r>
+        <w:tab/>
+      </w:r>
+      <w:r>
+        <w:tab/>
+      </w:r>
+      <w:r>
+        <w:tab/>
+      </w:r>
+      <w:r>
+        <w:tab/>
+      </w:r>
+      <w:r>
+        <w:tab/>
+      </w:r>
+      <w:r>
+        <w:tab/>
+      </w:r>
+      <w:r>
+        <w:tab/>
+      </w:r>
+      <w:r>
+        <w:tab/>
+      </w:r>
+      <w:r>
+        <w:tab/>
+      </w:r>
+      <w:r>
+        <w:tab/>
+      </w:r>
+      <w:r>
+        <w:tab/>
+      </w:r>
+      <w:r>
+        <w:tab/>
+      </w:r>
+      <w:r>
+        <w:tab/>
+      </w:r>
+      <w:r>
+        <w:tab/>
+      </w:r>
+      <w:r>
+        <w:tab/>
+      </w:r>
+      <w:r>
+        <w:tab/>
+      </w:r>
+      <w:r>
+        <w:tab/>
+      </w:r>
+      <w:r>
+        <w:tab/>
+      </w:r>
+      <w:r>
+        <w:tab/>
+      </w:r>
+      <w:r>
+        <w:tab/>
+      </w:r>
+      <w:r>
+        <w:tab/>
+      </w:r>
+      <w:r>
+        <w:tab/>
+      </w:r>
+      <w:r>
+        <w:tab/>
+      </w:r>
+      <w:r>
+        <w:tab/>
+      </w:r>
+      <w:r>
+        <w:tab/>
+      </w:r>
+      <w:r>
+        <w:tab/>
+      </w:r>
+      <w:r>
+        <w:tab/>
+      </w:r>
+      <w:r>
+        <w:tab/>
+      </w:r>
+      <w:r>
+        <w:tab/>
+      </w:r>
+      <w:r>
+        <w:tab/>
+      </w:r>
+      <w:r>
+        <w:tab/>
+      </w:r>
+      <w:r>
+        <w:tab/>
+      </w:r>
+      <w:r>
+        <w:tab/>
+      </w:r>
+      <w:r>
+        <w:tab/>
+      </w:r>
+      <w:r>
+        <w:tab/>
+      </w:r>
+      <w:r>
+        <w:tab/>
+      </w:r>
+      <w:r>
+        <w:tab/>
+      </w:r>
+      <w:r>
+        <w:tab/>
+      </w:r>
+      <w:r>
+        <w:tab/>
+      </w:r>
+      <w:r>
+        <w:tab/>
+      </w:r>
+      <w:r>
+        <w:tab/>
+      </w:r>
+      <w:r>
+        <w:tab/>
+      </w:r>
+      <w:r>
+        <w:tab/>
+      </w:r>
+      <w:r>
+        <w:tab/>
+      </w:r>
+      <w:r>
+        <w:tab/>
+      </w:r>
+      <w:r>
+        <w:tab/>
+      </w:r>
+      <w:r>
+        <w:tab/>
+      </w:r>
+      <w:r>
+        <w:tab/>
+      </w:r>
+      <w:r>
+        <w:tab/>
+      </w:r>
+      <w:r>
+        <w:tab/>
+      </w:r>
+      <w:r>
+        <w:tab/>
+      </w:r>
+      <w:r>
+        <w:tab/>
+      </w:r>
+      <w:r>
+        <w:tab/>
+      </w:r>
+      <w:r>
+        <w:tab/>
+      </w:r>
+      <w:r>
+        <w:tab/>
+      </w:r>
+      <w:r>
+        <w:tab/>
+      </w:r>
+      <w:r>
+        <w:tab/>
+      </w:r>
+      <w:r>
+        <w:tab/>
+      </w:r>
+      <w:r>
+        <w:tab/>
+      </w:r>
+      <w:r>
+        <w:tab/>
+      </w:r>
+      <w:r>
+        <w:tab/>
+      </w:r>
+      <w:r>
+        <w:tab/>
+      </w:r>
+      <w:r>
+        <w:tab/>
+      </w:r>
+      <w:r>
+        <w:tab/>
+      </w:r>
+      <w:r>
+        <w:tab/>
+      </w:r>
+      <w:r>
+        <w:tab/>
+      </w:r>
+      <w:r>
+        <w:tab/>
+      </w:r>
+      <w:r>
+        <w:tab/>
+      </w:r>
+      <w:r>
+        <w:tab/>
+      </w:r>
+      <w:r>
+        <w:tab/>
+      </w:r>
+      <w:r>
+        <w:tab/>
+      </w:r>
+      <w:r>
+        <w:tab/>
+      </w:r>
+      <w:r>
+        <w:tab/>
+      </w:r>
+      <w:r>
+        <w:tab/>
+      </w:r>
+      <w:r>
+        <w:tab/>
+      </w:r>
+      <w:r>
+        <w:tab/>
+      </w:r>
+      <w:r>
+        <w:tab/>
+      </w:r>
+      <w:r>
+        <w:tab/>
+      </w:r>
+      <w:r>
+        <w:tab/>
+      </w:r>
+      <w:r>
+        <w:tab/>
+      </w:r>
+      <w:r>
+        <w:tab/>
+      </w:r>
+      <w:r>
+        <w:tab/>
+      </w:r>
+      <w:r>
+        <w:tab/>
+      </w:r>
+      <w:r>
+        <w:tab/>
+      </w:r>
+      <w:r>
+        <w:tab/>
+      </w:r>
+      <w:r>
+        <w:tab/>
+      </w:r>
+      <w:r>
+        <w:tab/>
+      </w:r>
+      <w:r>
+        <w:tab/>
+      </w:r>
+      <w:r>
+        <w:tab/>
+      </w:r>
+      <w:r>
+        <w:tab/>
+      </w:r>
+      <w:r>
+        <w:tab/>
+      </w:r>
+      <w:r>
+        <w:tab/>
+      </w:r>
+      <w:r>
+        <w:tab/>
+      </w:r>
+      <w:r>
+        <w:tab/>
+      </w:r>
+      <w:r>
+        <w:tab/>
+      </w:r>
+      <w:r>
+        <w:tab/>
+      </w:r>
+      <w:r>
+        <w:tab/>
+      </w:r>
+      <w:r>
+        <w:tab/>
+      </w:r>
+      <w:r>
+        <w:tab/>
+      </w:r>
+      <w:r>
+        <w:tab/>
+      </w:r>
+      <w:r>
+        <w:tab/>
+      </w:r>
+      <w:r>
+        <w:tab/>
+      </w:r>
+      <w:r>
+        <w:tab/>
+      </w:r>
+      <w:r>
+        <w:tab/>
+      </w:r>
+      <w:r>
+        <w:tab/>
+      </w:r>
+      <w:r>
+        <w:tab/>
+      </w:r>
+      <w:r>
+        <w:tab/>
+      </w:r>
+      <w:r>
+        <w:tab/>
+      </w:r>
+      <w:r>
+        <w:tab/>
+      </w:r>
+      <w:r>
+        <w:tab/>
+      </w:r>
+      <w:r>
+        <w:tab/>
+      </w:r>
+      <w:r>
+        <w:tab/>
+      </w:r>
+      <w:r>
+        <w:tab/>
+      </w:r>
+      <w:r>
+        <w:tab/>
+      </w:r>
+      <w:r>
+        <w:tab/>
+      </w:r>
+      <w:r>
+        <w:tab/>
+      </w:r>
+      <w:r>
+        <w:tab/>
+      </w:r>
+      <w:r>
+        <w:tab/>
+      </w:r>
+      <w:r>
+        <w:tab/>
+      </w:r>
+      <w:r>
+        <w:tab/>
+      </w:r>
+      <w:r>
+        <w:tab/>
+      </w:r>
+      <w:r>
+        <w:tab/>
+      </w:r>
+      <w:r>
+        <w:tab/>
+      </w:r>
+      <w:r>
+        <w:tab/>
+      </w:r>
+      <w:r>
+        <w:tab/>
+      </w:r>
+      <w:r>
+        <w:tab/>
+      </w:r>
+      <w:r>
+        <w:tab/>
+      </w:r>
+      <w:r>
+        <w:tab/>
+      </w:r>
+      <w:r>
+        <w:tab/>
+      </w:r>
+      <w:r>
+        <w:tab/>
+      </w:r>
+      <w:r>
+        <w:tab/>
+      </w:r>
+      <w:r>
+        <w:tab/>
+      </w:r>
+      <w:r>
+        <w:tab/>
+      </w:r>
+      <w:r>
+        <w:tab/>
+      </w:r>
+      <w:r>
+        <w:tab/>
+      </w:r>
+      <w:r>
+        <w:tab/>
+      </w:r>
+      <w:r>
+        <w:tab/>
+      </w:r>
+      <w:r>
+        <w:tab/>
+      </w:r>
+      <w:r>
+        <w:tab/>
+      </w:r>
+      <w:r>
+        <w:tab/>
+      </w:r>
+      <w:r>
+        <w:tab/>
+      </w:r>
+      <w:r>
+        <w:tab/>
+      </w:r>
+      <w:r>
+        <w:tab/>
+      </w:r>
+      <w:r>
+        <w:tab/>
+      </w:r>
+      <w:r>
+        <w:tab/>
+      </w:r>
+      <w:r>
+        <w:tab/>
+      </w:r>
+      <w:r>
+        <w:tab/>
+      </w:r>
+      <w:r>
+        <w:tab/>
+      </w:r>
+      <w:r>
+        <w:tab/>
+      </w:r>
+      <w:r>
+        <w:tab/>
+      </w:r>
+      <w:r>
+        <w:tab/>
+      </w:r>
+      <w:r>
+        <w:tab/>
+      </w:r>
+      <w:r>
+        <w:tab/>
+      </w:r>
+      <w:r>
+        <w:tab/>
+      </w:r>
+      <w:r>
+        <w:tab/>
+      </w:r>
+      <w:r>
+        <w:tab/>
+      </w:r>
+      <w:r>
+        <w:tab/>
+      </w:r>
+      <w:r>
+        <w:tab/>
+      </w:r>
+      <w:r>
+        <w:tab/>
+      </w:r>
+      <w:r>
+        <w:tab/>
+      </w:r>
+      <w:r>
+        <w:tab/>
+      </w:r>
+      <w:r>
+        <w:tab/>
+      </w:r>
+      <w:r>
+        <w:tab/>
+      </w:r>
+      <w:r>
+        <w:tab/>
+      </w:r>
+      <w:r>
+        <w:tab/>
+      </w:r>
+      <w:r>
+        <w:tab/>
+      </w:r>
+      <w:r>
+        <w:tab/>
+      </w:r>
+      <w:r>
+        <w:tab/>
+      </w:r>
+      <w:r>
+        <w:tab/>
+      </w:r>
+      <w:r>
+        <w:tab/>
+      </w:r>
+      <w:r>
+        <w:tab/>
+      </w:r>
+      <w:r>
+        <w:tab/>
+      </w:r>
+      <w:r>
+        <w:tab/>
+      </w:r>
+      <w:r>
+        <w:tab/>
+      </w:r>
+      <w:r>
+        <w:tab/>
+      </w:r>
+      <w:r>
+        <w:tab/>
+      </w:r>
+      <w:r>
+        <w:tab/>
+      </w:r>
+      <w:r>
+        <w:tab/>
+      </w:r>
+      <w:r>
+        <w:tab/>
+      </w:r>
+      <w:r>
+        <w:tab/>
+      </w:r>
+      <w:r>
+        <w:tab/>
+      </w:r>
+      <w:r>
+        <w:tab/>
+      </w:r>
+      <w:r>
+        <w:tab/>
+      </w:r>
+      <w:r>
+        <w:tab/>
+      </w:r>
+      <w:r>
+        <w:tab/>
+      </w:r>
+      <w:r>
+        <w:tab/>
+      </w:r>
+      <w:r>
+        <w:tab/>
+      </w:r>
+      <w:r>
+        <w:tab/>
+      </w:r>
+      <w:r>
+        <w:tab/>
+      </w:r>
+      <w:r>
+        <w:tab/>
+      </w:r>
+      <w:r>
+        <w:tab/>
+      </w:r>
+      <w:r>
+        <w:tab/>
+      </w:r>
+      <w:r>
+        <w:tab/>
+      </w:r>
+      <w:r>
+        <w:tab/>
+      </w:r>
+      <w:r>
+        <w:tab/>
+      </w:r>
+      <w:r>
+        <w:tab/>
+      </w:r>
+      <w:r>
+        <w:tab/>
+      </w:r>
+      <w:r>
+        <w:tab/>
+      </w:r>
+      <w:r>
+        <w:tab/>
+      </w:r>
+      <w:r>
+        <w:tab/>
+      </w:r>
+      <w:r>
+        <w:tab/>
+      </w:r>
+      <w:r>
+        <w:tab/>
+      </w:r>
+      <w:r>
+        <w:tab/>
+      </w:r>
+      <w:r>
+        <w:tab/>
+      </w:r>
+      <w:r>
+        <w:tab/>
+      </w:r>
+      <w:r>
+        <w:tab/>
+      </w:r>
+      <w:r>
+        <w:tab/>
+      </w:r>
+      <w:r>
+        <w:tab/>
+      </w:r>
+      <w:r>
+        <w:tab/>
+      </w:r>
+      <w:r>
+        <w:tab/>
+      </w:r>
+      <w:r>
+        <w:tab/>
+      </w:r>
+      <w:r>
+        <w:tab/>
+      </w:r>
+      <w:r>
+        <w:tab/>
+      </w:r>
+      <w:r>
+        <w:tab/>
+      </w:r>
+      <w:r>
+        <w:tab/>
+      </w:r>
+      <w:r>
+        <w:tab/>
+      </w:r>
+      <w:r>
+        <w:tab/>
+      </w:r>
+      <w:r>
+        <w:tab/>
+      </w:r>
+      <w:r>
+        <w:tab/>
+      </w:r>
+      <w:r>
+        <w:tab/>
+      </w:r>
+      <w:r>
+        <w:tab/>
+      </w:r>
+      <w:r>
+        <w:tab/>
+      </w:r>
+      <w:r>
+        <w:tab/>
+      </w:r>
+      <w:r>
+        <w:tab/>
+      </w:r>
+      <w:r>
+        <w:tab/>
+      </w:r>
+      <w:r>
+        <w:tab/>
+      </w:r>
+      <w:r>
+        <w:tab/>
+      </w:r>
+      <w:r>
+        <w:tab/>
+      </w:r>
+      <w:r>
+        <w:tab/>
+      </w:r>
+      <w:r>
+        <w:tab/>
+      </w:r>
+      <w:r>
+        <w:tab/>
+      </w:r>
+      <w:r>
+        <w:tab/>
+      </w:r>
+      <w:r>
+        <w:tab/>
+      </w:r>
+      <w:r>
+        <w:tab/>
+      </w:r>
+      <w:r>
+        <w:tab/>
+      </w:r>
+      <w:r>
+        <w:tab/>
+      </w:r>
+      <w:r>
+        <w:tab/>
+      </w:r>
+      <w:r>
+        <w:tab/>
+      </w:r>
+      <w:r>
+        <w:tab/>
+      </w:r>
+      <w:r>
+        <w:tab/>
+      </w:r>
+      <w:r>
+        <w:tab/>
+      </w:r>
+      <w:r>
+        <w:tab/>
+      </w:r>
+      <w:r>
+        <w:tab/>
+      </w:r>
+      <w:r>
+        <w:tab/>
+      </w:r>
+      <w:r>
+        <w:tab/>
+      </w:r>
+      <w:r>
+        <w:tab/>
+      </w:r>
+      <w:r>
+        <w:tab/>
+      </w:r>
+      <w:r>
+        <w:tab/>
+      </w:r>
+      <w:r>
+        <w:tab/>
+      </w:r>
+      <w:r>
+        <w:tab/>
+      </w:r>
+      <w:r>
+        <w:tab/>
+      </w:r>
+      <w:r>
+        <w:tab/>
+      </w:r>
+      <w:r>
+        <w:tab/>
+      </w:r>
+      <w:r>
+        <w:tab/>
+      </w:r>
+      <w:r>
+        <w:tab/>
+      </w:r>
+      <w:r>
+        <w:tab/>
+      </w:r>
+      <w:r>
+        <w:tab/>
+      </w:r>
+      <w:r>
+        <w:tab/>
+      </w:r>
+      <w:r>
+        <w:tab/>
+      </w:r>
+      <w:r>
+        <w:tab/>
+      </w:r>
+      <w:r>
+        <w:tab/>
+      </w:r>
+      <w:r>
+        <w:tab/>
+      </w:r>
+      <w:r>
+        <w:tab/>
+      </w:r>
+      <w:r>
+        <w:tab/>
+      </w:r>
+      <w:r>
+        <w:tab/>
+      </w:r>
+      <w:r>
+        <w:tab/>
+      </w:r>
+      <w:r>
+        <w:tab/>
+      </w:r>
+      <w:r>
+        <w:tab/>
+      </w:r>
+      <w:r>
+        <w:tab/>
+      </w:r>
+      <w:r>
+        <w:tab/>
+      </w:r>
+      <w:r>
+        <w:tab/>
+      </w:r>
+      <w:r>
+        <w:tab/>
+      </w:r>
+      <w:r>
+        <w:tab/>
+      </w:r>
+      <w:r>
+        <w:tab/>
+      </w:r>
+      <w:r>
+        <w:tab/>
+      </w:r>
+      <w:r>
+        <w:tab/>
+      </w:r>
+      <w:r>
+        <w:tab/>
+      </w:r>
+      <w:r>
+        <w:tab/>
+      </w:r>
+      <w:r>
+        <w:tab/>
+      </w:r>
+      <w:r>
+        <w:tab/>
+      </w:r>
+      <w:r>
+        <w:tab/>
+      </w:r>
+      <w:r>
+        <w:tab/>
+      </w:r>
+      <w:r>
+        <w:tab/>
+      </w:r>
+      <w:r>
+        <w:tab/>
+      </w:r>
+      <w:r>
+        <w:tab/>
+      </w:r>
+      <w:r>
+        <w:tab/>
+      </w:r>
+      <w:r>
+        <w:tab/>
+      </w:r>
+      <w:r>
+        <w:tab/>
+      </w:r>
+      <w:r>
+        <w:tab/>
+      </w:r>
+      <w:r>
+        <w:tab/>
+      </w:r>
+      <w:r>
+        <w:tab/>
+      </w:r>
+      <w:r>
+        <w:tab/>
+      </w:r>
+      <w:r>
+        <w:tab/>
+      </w:r>
+      <w:r>
+        <w:tab/>
+      </w:r>
+      <w:r>
+        <w:tab/>
+      </w:r>
+      <w:r>
+        <w:tab/>
+      </w:r>
+      <w:r>
+        <w:tab/>
+      </w:r>
+      <w:r>
+        <w:tab/>
+      </w:r>
+      <w:r>
+        <w:tab/>
+      </w:r>
+      <w:r>
+        <w:tab/>
+      </w:r>
+      <w:r>
+        <w:tab/>
+      </w:r>
+      <w:r>
+        <w:tab/>
+      </w:r>
+      <w:r>
+        <w:tab/>
+      </w:r>
+      <w:r>
+        <w:tab/>
+      </w:r>
+      <w:r>
+        <w:tab/>
+      </w:r>
+      <w:r>
+        <w:tab/>
+      </w:r>
+      <w:r>
+        <w:tab/>
+      </w:r>
+      <w:r>
+        <w:tab/>
+      </w:r>
+      <w:r>
+        <w:tab/>
+      </w:r>
+      <w:r>
+        <w:tab/>
+      </w:r>
+      <w:r>
+        <w:tab/>
+      </w:r>
+      <w:r>
+        <w:tab/>
+      </w:r>
+      <w:r>
+        <w:tab/>
+      </w:r>
+      <w:r>
+        <w:tab/>
+      </w:r>
+      <w:r>
+        <w:tab/>
+      </w:r>
+      <w:r>
+        <w:tab/>
+      </w:r>
+      <w:r>
+        <w:tab/>
+      </w:r>
+      <w:r>
+        <w:tab/>
+      </w:r>
+      <w:r>
+        <w:tab/>
+      </w:r>
+      <w:r>
+        <w:tab/>
+      </w:r>
+      <w:r>
+        <w:tab/>
+      </w:r>
+      <w:r>
+        <w:tab/>
+      </w:r>
+      <w:r>
+        <w:tab/>
+      </w:r>
+      <w:r>
+        <w:tab/>
+      </w:r>
+      <w:r>
+        <w:tab/>
+      </w:r>
+      <w:r>
+        <w:tab/>
+      </w:r>
+      <w:r>
+        <w:tab/>
+      </w:r>
+      <w:r>
+        <w:tab/>
+      </w:r>
+      <w:r>
+        <w:tab/>
+      </w:r>
+      <w:r>
+        <w:tab/>
+      </w:r>
+      <w:r>
+        <w:tab/>
+      </w:r>
+      <w:r>
+        <w:tab/>
+      </w:r>
+      <w:r>
+        <w:tab/>
+      </w:r>
+      <w:r>
+        <w:tab/>
+      </w:r>
+      <w:r>
+        <w:tab/>
+      </w:r>
+      <w:r>
+        <w:tab/>
+      </w:r>
+      <w:r>
+        <w:tab/>
+      </w:r>
+      <w:r>
+        <w:tab/>
+      </w:r>
+      <w:r>
+        <w:tab/>
+      </w:r>
+      <w:r>
+        <w:tab/>
+      </w:r>
+      <w:r>
+        <w:tab/>
+      </w:r>
+      <w:r>
+        <w:tab/>
+      </w:r>
+      <w:r>
+        <w:tab/>
+      </w:r>
+      <w:r>
+        <w:tab/>
+      </w:r>
+      <w:r>
+        <w:tab/>
+      </w:r>
+      <w:r>
+        <w:tab/>
+      </w:r>
+      <w:r>
+        <w:tab/>
+      </w:r>
+      <w:r>
+        <w:tab/>
+      </w:r>
+      <w:r>
+        <w:tab/>
+      </w:r>
+      <w:r>
+        <w:tab/>
+      </w:r>
+      <w:r>
+        <w:tab/>
+      </w:r>
+      <w:r>
+        <w:tab/>
+      </w:r>
+      <w:r>
+        <w:tab/>
+      </w:r>
+      <w:r>
+        <w:tab/>
+      </w:r>
+      <w:r>
+        <w:tab/>
+      </w:r>
+      <w:r>
+        <w:tab/>
+      </w:r>
+      <w:r>
+        <w:tab/>
+      </w:r>
+      <w:r>
+        <w:tab/>
+      </w:r>
+      <w:r>
+        <w:tab/>
+      </w:r>
+      <w:r>
+        <w:tab/>
+      </w:r>
+      <w:r>
+        <w:tab/>
+      </w:r>
+      <w:r>
+        <w:tab/>
+      </w:r>
+      <w:r>
+        <w:tab/>
+      </w:r>
+      <w:r>
+        <w:tab/>
+      </w:r>
+      <w:r>
+        <w:tab/>
+      </w:r>
+      <w:r>
+        <w:tab/>
+      </w:r>
+      <w:r>
+        <w:tab/>
+      </w:r>
+      <w:r>
+        <w:tab/>
+      </w:r>
+      <w:r>
+        <w:tab/>
+      </w:r>
+      <w:r>
+        <w:tab/>
+      </w:r>
+    </w:p>
+    <w:p>
+      <w:pPr>
+        <w:pStyle w:val="Heading1"/>
+      </w:pPr>
+      <w:r>
+        <w:t>Class Diagram</w:t>
+      </w:r>
+    </w:p>
+    <w:p/>
+    <w:p>
+      <w:r>
+        <w:rPr>
+          <w:noProof/>
+        </w:rPr>
+        <w:drawing>
+          <wp:anchor distT="0" distB="0" distL="114300" distR="114300" simplePos="0" relativeHeight="251676672" behindDoc="0" locked="0" layoutInCell="1" allowOverlap="1" wp14:anchorId="3587862D" wp14:editId="76790569">
+            <wp:simplePos x="0" y="0"/>
+            <wp:positionH relativeFrom="column">
+              <wp:posOffset>0</wp:posOffset>
+            </wp:positionH>
+            <wp:positionV relativeFrom="paragraph">
+              <wp:posOffset>-635</wp:posOffset>
+            </wp:positionV>
+            <wp:extent cx="5943600" cy="4911725"/>
+            <wp:effectExtent l="0" t="0" r="0" b="3175"/>
+            <wp:wrapNone/>
+            <wp:docPr id="306041256" name="Picture 1"/>
+            <wp:cNvGraphicFramePr>
+              <a:graphicFrameLocks xmlns:a="http://schemas.openxmlformats.org/drawingml/2006/main" noChangeAspect="1"/>
+            </wp:cNvGraphicFramePr>
+            <a:graphic xmlns:a="http://schemas.openxmlformats.org/drawingml/2006/main">
+              <a:graphicData uri="http://schemas.openxmlformats.org/drawingml/2006/picture">
+                <pic:pic xmlns:pic="http://schemas.openxmlformats.org/drawingml/2006/picture">
+                  <pic:nvPicPr>
+                    <pic:cNvPr id="306041256" name="Picture 306041256"/>
+                    <pic:cNvPicPr/>
+                  </pic:nvPicPr>
+                  <pic:blipFill>
+                    <a:blip r:embed="rId21" cstate="print">
+                      <a:extLst>
+                        <a:ext uri="{28A0092B-C50C-407E-A947-70E740481C1C}">
+                          <a14:useLocalDpi xmlns:a14="http://schemas.microsoft.com/office/drawing/2010/main" val="0"/>
+                        </a:ext>
+                      </a:extLst>
+                    </a:blip>
+                    <a:stretch>
+                      <a:fillRect/>
+                    </a:stretch>
+                  </pic:blipFill>
+                  <pic:spPr>
+                    <a:xfrm>
+                      <a:off x="0" y="0"/>
+                      <a:ext cx="5943600" cy="4911725"/>
+                    </a:xfrm>
+                    <a:prstGeom prst="rect">
+                      <a:avLst/>
+                    </a:prstGeom>
+                  </pic:spPr>
+                </pic:pic>
+              </a:graphicData>
+            </a:graphic>
+          </wp:anchor>
+        </w:drawing>
+      </w:r>
+      <w:r>
+        <w:tab/>
+      </w:r>
+      <w:r>
+        <w:tab/>
+      </w:r>
+      <w:r>
+        <w:tab/>
+      </w:r>
+      <w:r>
+        <w:tab/>
+      </w:r>
+      <w:r>
+        <w:tab/>
+      </w:r>
+      <w:r>
+        <w:tab/>
+      </w:r>
+      <w:r>
+        <w:tab/>
+      </w:r>
+      <w:r>
+        <w:tab/>
+      </w:r>
+      <w:r>
+        <w:tab/>
+      </w:r>
+      <w:r>
+        <w:tab/>
+      </w:r>
+      <w:r>
+        <w:tab/>
+      </w:r>
+      <w:r>
+        <w:tab/>
+      </w:r>
+      <w:r>
+        <w:tab/>
+      </w:r>
+      <w:r>
+        <w:tab/>
+      </w:r>
+      <w:r>
+        <w:tab/>
+      </w:r>
+      <w:r>
+        <w:tab/>
+      </w:r>
+      <w:r>
+        <w:tab/>
+      </w:r>
+      <w:r>
+        <w:tab/>
+      </w:r>
+      <w:r>
+        <w:tab/>
+      </w:r>
+      <w:r>
+        <w:tab/>
+      </w:r>
+      <w:r>
+        <w:tab/>
+      </w:r>
+      <w:r>
+        <w:tab/>
+      </w:r>
+      <w:r>
+        <w:tab/>
+      </w:r>
+      <w:r>
+        <w:tab/>
+      </w:r>
+      <w:r>
+        <w:tab/>
+      </w:r>
+      <w:r>
+        <w:tab/>
+      </w:r>
+      <w:r>
+        <w:tab/>
+      </w:r>
+      <w:r>
+        <w:tab/>
+      </w:r>
+      <w:r>
+        <w:tab/>
+      </w:r>
+      <w:r>
+        <w:tab/>
+      </w:r>
+      <w:r>
+        <w:tab/>
+      </w:r>
+      <w:r>
+        <w:tab/>
+      </w:r>
+      <w:r>
+        <w:tab/>
+      </w:r>
+      <w:r>
+        <w:tab/>
+      </w:r>
+      <w:r>
+        <w:tab/>
+      </w:r>
+      <w:r>
+        <w:tab/>
+      </w:r>
+      <w:r>
+        <w:tab/>
+      </w:r>
+      <w:r>
+        <w:tab/>
+      </w:r>
+      <w:r>
+        <w:tab/>
+      </w:r>
+      <w:r>
+        <w:tab/>
+      </w:r>
+      <w:r>
+        <w:tab/>
+      </w:r>
+      <w:r>
+        <w:tab/>
+      </w:r>
+      <w:r>
+        <w:tab/>
+      </w:r>
+      <w:r>
+        <w:tab/>
+      </w:r>
+      <w:r>
+        <w:tab/>
+      </w:r>
+      <w:r>
+        <w:tab/>
+      </w:r>
+      <w:r>
+        <w:tab/>
+      </w:r>
+      <w:r>
+        <w:tab/>
+      </w:r>
+      <w:r>
+        <w:tab/>
+      </w:r>
+      <w:r>
+        <w:tab/>
+      </w:r>
+      <w:r>
+        <w:tab/>
+      </w:r>
+      <w:r>
+        <w:tab/>
+      </w:r>
+      <w:r>
+        <w:tab/>
+      </w:r>
+      <w:r>
+        <w:tab/>
+      </w:r>
+      <w:r>
+        <w:tab/>
+      </w:r>
+      <w:r>
+        <w:tab/>
+      </w:r>
+      <w:r>
+        <w:tab/>
+      </w:r>
+      <w:r>
+        <w:tab/>
+      </w:r>
+      <w:r>
+        <w:tab/>
+      </w:r>
+      <w:r>
+        <w:tab/>
+      </w:r>
+      <w:r>
+        <w:tab/>
+      </w:r>
+      <w:r>
+        <w:tab/>
+      </w:r>
+      <w:r>
+        <w:tab/>
+      </w:r>
+      <w:r>
+        <w:tab/>
+      </w:r>
+      <w:r>
+        <w:tab/>
+      </w:r>
+      <w:r>
+        <w:tab/>
+      </w:r>
+      <w:r>
+        <w:tab/>
+      </w:r>
+      <w:r>
+        <w:tab/>
+      </w:r>
+      <w:r>
+        <w:tab/>
+      </w:r>
+      <w:r>
+        <w:tab/>
+      </w:r>
+      <w:r>
+        <w:tab/>
+      </w:r>
+      <w:r>
+        <w:tab/>
+      </w:r>
+      <w:r>
+        <w:tab/>
+      </w:r>
+      <w:r>
+        <w:tab/>
+      </w:r>
+      <w:r>
+        <w:tab/>
+      </w:r>
+      <w:r>
+        <w:tab/>
+      </w:r>
+      <w:r>
+        <w:tab/>
+      </w:r>
+      <w:r>
+        <w:tab/>
+      </w:r>
+      <w:r>
+        <w:tab/>
+      </w:r>
+      <w:r>
+        <w:tab/>
+      </w:r>
+      <w:r>
+        <w:tab/>
+      </w:r>
+      <w:r>
+        <w:tab/>
+      </w:r>
+      <w:r>
+        <w:tab/>
+      </w:r>
+      <w:r>
+        <w:tab/>
+      </w:r>
+      <w:r>
+        <w:tab/>
+      </w:r>
+      <w:r>
+        <w:tab/>
+      </w:r>
+      <w:r>
+        <w:tab/>
+      </w:r>
+      <w:r>
+        <w:tab/>
+      </w:r>
+      <w:r>
+        <w:tab/>
+      </w:r>
+      <w:r>
+        <w:tab/>
+      </w:r>
+      <w:r>
+        <w:tab/>
+      </w:r>
+      <w:r>
+        <w:tab/>
+      </w:r>
+      <w:r>
+        <w:tab/>
+      </w:r>
+      <w:r>
+        <w:tab/>
+      </w:r>
+      <w:r>
+        <w:tab/>
+      </w:r>
+      <w:r>
+        <w:tab/>
+      </w:r>
+      <w:r>
+        <w:tab/>
+      </w:r>
+      <w:r>
+        <w:tab/>
+      </w:r>
+      <w:r>
+        <w:tab/>
+      </w:r>
+      <w:r>
+        <w:tab/>
+      </w:r>
+      <w:r>
+        <w:tab/>
+      </w:r>
+      <w:r>
+        <w:tab/>
+      </w:r>
+      <w:r>
+        <w:tab/>
+      </w:r>
+      <w:r>
+        <w:tab/>
+      </w:r>
+      <w:r>
+        <w:tab/>
+      </w:r>
+      <w:r>
+        <w:tab/>
+      </w:r>
+      <w:r>
+        <w:tab/>
+      </w:r>
+      <w:r>
+        <w:tab/>
+      </w:r>
+      <w:r>
+        <w:tab/>
+      </w:r>
+      <w:r>
+        <w:tab/>
+      </w:r>
+      <w:r>
+        <w:tab/>
+      </w:r>
+      <w:r>
+        <w:tab/>
+      </w:r>
+      <w:r>
+        <w:tab/>
+      </w:r>
+      <w:r>
+        <w:tab/>
+      </w:r>
+      <w:r>
+        <w:tab/>
+      </w:r>
+      <w:r>
+        <w:tab/>
+      </w:r>
+      <w:r>
+        <w:tab/>
+      </w:r>
+      <w:r>
+        <w:tab/>
+      </w:r>
+      <w:r>
+        <w:tab/>
+      </w:r>
+      <w:r>
+        <w:tab/>
+      </w:r>
+      <w:r>
+        <w:tab/>
+      </w:r>
+      <w:r>
+        <w:tab/>
+      </w:r>
+      <w:r>
+        <w:tab/>
+      </w:r>
+      <w:r>
+        <w:tab/>
+      </w:r>
+      <w:r>
+        <w:tab/>
+      </w:r>
+      <w:r>
+        <w:tab/>
+      </w:r>
+      <w:r>
+        <w:tab/>
+      </w:r>
+      <w:r>
+        <w:tab/>
+      </w:r>
+      <w:r>
+        <w:tab/>
+      </w:r>
+      <w:r>
+        <w:tab/>
+      </w:r>
+      <w:r>
+        <w:tab/>
+      </w:r>
+      <w:r>
+        <w:tab/>
+      </w:r>
+      <w:r>
+        <w:tab/>
+      </w:r>
+      <w:r>
+        <w:tab/>
+      </w:r>
+      <w:r>
+        <w:tab/>
+      </w:r>
+      <w:r>
+        <w:tab/>
+      </w:r>
+      <w:r>
+        <w:tab/>
+      </w:r>
+      <w:r>
+        <w:tab/>
+      </w:r>
+      <w:r>
+        <w:tab/>
+      </w:r>
+      <w:r>
+        <w:tab/>
+      </w:r>
+      <w:r>
+        <w:tab/>
+      </w:r>
+      <w:r>
+        <w:tab/>
+      </w:r>
+      <w:r>
+        <w:tab/>
+      </w:r>
+      <w:r>
+        <w:tab/>
+      </w:r>
+      <w:r>
+        <w:tab/>
+      </w:r>
+      <w:r>
+        <w:tab/>
+      </w:r>
+      <w:r>
+        <w:tab/>
+      </w:r>
+      <w:r>
+        <w:tab/>
+      </w:r>
+      <w:r>
+        <w:tab/>
+      </w:r>
+      <w:r>
+        <w:tab/>
+      </w:r>
+      <w:r>
+        <w:tab/>
+      </w:r>
+      <w:r>
+        <w:tab/>
+      </w:r>
+      <w:r>
+        <w:tab/>
+      </w:r>
+      <w:r>
+        <w:tab/>
+      </w:r>
+      <w:r>
+        <w:tab/>
+      </w:r>
+      <w:r>
+        <w:tab/>
+      </w:r>
+      <w:r>
+        <w:tab/>
+      </w:r>
+      <w:r>
+        <w:tab/>
+      </w:r>
+      <w:r>
+        <w:tab/>
+      </w:r>
+      <w:r>
+        <w:tab/>
+      </w:r>
+      <w:r>
+        <w:tab/>
+      </w:r>
+      <w:r>
+        <w:tab/>
+      </w:r>
+      <w:r>
+        <w:tab/>
+      </w:r>
+      <w:r>
+        <w:tab/>
+      </w:r>
+      <w:r>
+        <w:tab/>
+      </w:r>
+      <w:r>
+        <w:tab/>
+      </w:r>
+      <w:r>
+        <w:tab/>
+      </w:r>
+      <w:r>
+        <w:tab/>
+      </w:r>
+      <w:r>
+        <w:tab/>
+      </w:r>
+      <w:r>
+        <w:tab/>
+      </w:r>
+      <w:r>
+        <w:tab/>
+      </w:r>
+      <w:r>
+        <w:tab/>
+      </w:r>
+      <w:r>
+        <w:tab/>
+      </w:r>
+      <w:r>
+        <w:tab/>
+      </w:r>
+      <w:r>
+        <w:tab/>
+      </w:r>
+      <w:r>
+        <w:tab/>
+      </w:r>
+      <w:r>
+        <w:tab/>
+      </w:r>
+      <w:r>
+        <w:tab/>
+      </w:r>
+      <w:r>
+        <w:tab/>
+      </w:r>
+      <w:r>
+        <w:tab/>
+      </w:r>
+      <w:r>
+        <w:tab/>
+      </w:r>
+      <w:r>
+        <w:tab/>
+      </w:r>
+      <w:r>
+        <w:tab/>
+      </w:r>
+      <w:r>
+        <w:tab/>
+      </w:r>
+      <w:r>
+        <w:tab/>
+      </w:r>
+      <w:r>
+        <w:tab/>
+      </w:r>
+      <w:r>
+        <w:tab/>
+      </w:r>
+      <w:r>
+        <w:tab/>
+      </w:r>
+      <w:r>
+        <w:tab/>
+      </w:r>
+      <w:r>
+        <w:tab/>
+      </w:r>
+      <w:r>
+        <w:tab/>
+      </w:r>
+      <w:r>
+        <w:tab/>
+      </w:r>
+      <w:r>
+        <w:tab/>
+      </w:r>
+      <w:r>
+        <w:tab/>
+      </w:r>
+      <w:r>
+        <w:tab/>
+      </w:r>
+      <w:r>
+        <w:tab/>
+      </w:r>
+      <w:r>
+        <w:tab/>
+      </w:r>
+      <w:r>
+        <w:tab/>
+      </w:r>
+      <w:r>
+        <w:tab/>
+      </w:r>
+      <w:r>
+        <w:tab/>
+      </w:r>
+      <w:r>
+        <w:tab/>
+      </w:r>
+      <w:r>
+        <w:tab/>
+      </w:r>
+      <w:r>
+        <w:tab/>
+      </w:r>
+      <w:r>
+        <w:tab/>
+      </w:r>
+      <w:r>
+        <w:tab/>
+      </w:r>
+      <w:r>
+        <w:tab/>
+      </w:r>
+      <w:r>
+        <w:tab/>
+      </w:r>
+      <w:r>
+        <w:tab/>
+      </w:r>
+      <w:r>
+        <w:tab/>
+      </w:r>
+      <w:r>
+        <w:tab/>
+      </w:r>
+      <w:r>
+        <w:tab/>
+      </w:r>
+      <w:r>
+        <w:tab/>
+      </w:r>
+      <w:r>
+        <w:tab/>
+      </w:r>
+      <w:r>
+        <w:tab/>
+      </w:r>
+      <w:r>
+        <w:tab/>
+      </w:r>
+      <w:r>
+        <w:tab/>
+      </w:r>
+      <w:r>
+        <w:tab/>
+      </w:r>
+      <w:r>
+        <w:tab/>
+      </w:r>
+      <w:r>
+        <w:tab/>
+      </w:r>
+      <w:r>
+        <w:tab/>
+      </w:r>
+      <w:r>
+        <w:tab/>
+      </w:r>
+      <w:r>
+        <w:tab/>
+      </w:r>
+      <w:r>
+        <w:tab/>
+      </w:r>
+      <w:r>
+        <w:tab/>
+      </w:r>
+      <w:r>
+        <w:tab/>
+      </w:r>
+      <w:r>
+        <w:tab/>
+      </w:r>
+      <w:r>
+        <w:tab/>
+      </w:r>
+      <w:r>
+        <w:tab/>
+      </w:r>
+      <w:r>
+        <w:tab/>
+      </w:r>
+      <w:r>
+        <w:tab/>
+      </w:r>
+      <w:r>
+        <w:tab/>
+      </w:r>
+      <w:r>
+        <w:tab/>
+      </w:r>
+      <w:r>
+        <w:tab/>
+      </w:r>
+      <w:r>
+        <w:tab/>
+      </w:r>
+      <w:r>
+        <w:tab/>
+      </w:r>
+      <w:r>
+        <w:tab/>
+      </w:r>
+      <w:r>
+        <w:tab/>
+      </w:r>
+      <w:r>
+        <w:tab/>
+      </w:r>
+      <w:r>
+        <w:tab/>
+      </w:r>
+      <w:r>
+        <w:tab/>
+      </w:r>
+      <w:r>
+        <w:tab/>
+      </w:r>
+      <w:r>
+        <w:tab/>
+      </w:r>
+      <w:r>
+        <w:tab/>
+      </w:r>
+      <w:r>
+        <w:tab/>
+      </w:r>
+      <w:r>
+        <w:tab/>
+      </w:r>
+      <w:r>
+        <w:tab/>
+      </w:r>
+      <w:r>
+        <w:tab/>
+      </w:r>
+      <w:r>
+        <w:tab/>
+      </w:r>
+      <w:r>
+        <w:tab/>
+      </w:r>
+      <w:r>
+        <w:tab/>
+      </w:r>
+      <w:r>
+        <w:tab/>
+      </w:r>
+      <w:r>
+        <w:tab/>
+      </w:r>
+      <w:r>
+        <w:tab/>
+      </w:r>
+      <w:r>
+        <w:tab/>
+      </w:r>
+      <w:r>
+        <w:tab/>
+      </w:r>
+      <w:r>
+        <w:tab/>
+      </w:r>
+      <w:r>
+        <w:tab/>
+      </w:r>
+      <w:r>
+        <w:tab/>
+      </w:r>
+      <w:r>
+        <w:tab/>
+      </w:r>
+      <w:r>
+        <w:tab/>
+      </w:r>
+      <w:r>
+        <w:tab/>
+      </w:r>
+      <w:r>
+        <w:tab/>
+      </w:r>
+      <w:r>
+        <w:tab/>
+      </w:r>
+      <w:r>
+        <w:tab/>
+      </w:r>
+      <w:r>
+        <w:tab/>
+      </w:r>
+      <w:r>
+        <w:tab/>
+      </w:r>
+      <w:r>
+        <w:tab/>
+      </w:r>
+      <w:r>
+        <w:tab/>
+      </w:r>
+      <w:r>
+        <w:tab/>
+      </w:r>
+      <w:r>
+        <w:tab/>
+      </w:r>
+      <w:r>
+        <w:tab/>
+      </w:r>
+      <w:r>
+        <w:tab/>
+      </w:r>
+      <w:r>
+        <w:tab/>
+      </w:r>
+      <w:r>
+        <w:tab/>
+      </w:r>
+      <w:r>
+        <w:tab/>
+      </w:r>
+      <w:r>
+        <w:tab/>
+      </w:r>
+      <w:r>
+        <w:tab/>
+      </w:r>
+      <w:r>
+        <w:tab/>
+      </w:r>
+      <w:r>
+        <w:tab/>
+      </w:r>
+      <w:r>
+        <w:tab/>
+      </w:r>
+      <w:r>
+        <w:tab/>
+      </w:r>
+      <w:r>
+        <w:tab/>
+      </w:r>
+      <w:r>
+        <w:tab/>
+      </w:r>
+      <w:r>
+        <w:tab/>
+      </w:r>
+      <w:r>
+        <w:tab/>
+      </w:r>
+      <w:r>
+        <w:tab/>
+      </w:r>
+      <w:r>
+        <w:tab/>
+      </w:r>
+      <w:r>
+        <w:tab/>
+      </w:r>
+      <w:r>
+        <w:tab/>
+      </w:r>
+      <w:r>
+        <w:tab/>
+      </w:r>
+      <w:r>
+        <w:tab/>
+      </w:r>
+      <w:r>
+        <w:tab/>
+      </w:r>
+      <w:r>
+        <w:tab/>
+      </w:r>
+      <w:r>
+        <w:tab/>
+      </w:r>
+      <w:r>
+        <w:tab/>
+      </w:r>
+      <w:r>
+        <w:tab/>
+      </w:r>
+      <w:r>
+        <w:tab/>
+      </w:r>
+      <w:r>
+        <w:tab/>
+      </w:r>
+      <w:r>
+        <w:tab/>
+      </w:r>
+      <w:r>
+        <w:tab/>
+      </w:r>
+      <w:r>
+        <w:tab/>
+      </w:r>
+    </w:p>
+    <w:p/>
+    <w:p>
+      <w:r>
+        <w:br w:type="page"/>
+      </w:r>
+    </w:p>
+    <w:p>
+      <w:pPr>
+        <w:pStyle w:val="Heading1"/>
+      </w:pPr>
+      <w:r>
+        <w:t>ER Diagram</w:t>
+      </w:r>
+    </w:p>
+    <w:p/>
+    <w:p>
+      <w:r>
+        <w:rPr>
+          <w:noProof/>
+        </w:rPr>
+        <w:drawing>
+          <wp:anchor distT="0" distB="0" distL="114300" distR="114300" simplePos="0" relativeHeight="251677696" behindDoc="0" locked="0" layoutInCell="1" allowOverlap="1" wp14:anchorId="76BD7DFB" wp14:editId="3330749B">
+            <wp:simplePos x="0" y="0"/>
+            <wp:positionH relativeFrom="column">
+              <wp:posOffset>0</wp:posOffset>
+            </wp:positionH>
+            <wp:positionV relativeFrom="paragraph">
+              <wp:posOffset>-635</wp:posOffset>
+            </wp:positionV>
+            <wp:extent cx="5943600" cy="2792095"/>
+            <wp:effectExtent l="0" t="0" r="0" b="8255"/>
+            <wp:wrapNone/>
+            <wp:docPr id="2061290952" name="Picture 2"/>
+            <wp:cNvGraphicFramePr>
+              <a:graphicFrameLocks xmlns:a="http://schemas.openxmlformats.org/drawingml/2006/main" noChangeAspect="1"/>
+            </wp:cNvGraphicFramePr>
+            <a:graphic xmlns:a="http://schemas.openxmlformats.org/drawingml/2006/main">
+              <a:graphicData uri="http://schemas.openxmlformats.org/drawingml/2006/picture">
+                <pic:pic xmlns:pic="http://schemas.openxmlformats.org/drawingml/2006/picture">
+                  <pic:nvPicPr>
+                    <pic:cNvPr id="2061290952" name="Picture 2061290952"/>
+                    <pic:cNvPicPr/>
+                  </pic:nvPicPr>
+                  <pic:blipFill>
+                    <a:blip r:embed="rId22" cstate="print">
+                      <a:extLst>
+                        <a:ext uri="{28A0092B-C50C-407E-A947-70E740481C1C}">
+                          <a14:useLocalDpi xmlns:a14="http://schemas.microsoft.com/office/drawing/2010/main" val="0"/>
+                        </a:ext>
+                      </a:extLst>
+                    </a:blip>
+                    <a:stretch>
+                      <a:fillRect/>
+                    </a:stretch>
+                  </pic:blipFill>
+                  <pic:spPr>
+                    <a:xfrm>
+                      <a:off x="0" y="0"/>
+                      <a:ext cx="5943600" cy="2792095"/>
+                    </a:xfrm>
+                    <a:prstGeom prst="rect">
+                      <a:avLst/>
+                    </a:prstGeom>
+                  </pic:spPr>
+                </pic:pic>
+              </a:graphicData>
+            </a:graphic>
+          </wp:anchor>
+        </w:drawing>
+      </w:r>
+      <w:r>
+        <w:tab/>
+      </w:r>
+      <w:r>
+        <w:tab/>
+      </w:r>
+      <w:r>
+        <w:tab/>
+      </w:r>
+      <w:r>
+        <w:tab/>
+      </w:r>
+      <w:r>
+        <w:tab/>
+      </w:r>
+      <w:r>
+        <w:tab/>
+      </w:r>
+      <w:r>
+        <w:tab/>
+      </w:r>
+      <w:r>
+        <w:tab/>
+      </w:r>
+      <w:r>
+        <w:tab/>
+      </w:r>
+      <w:r>
+        <w:tab/>
+      </w:r>
+      <w:r>
+        <w:tab/>
+      </w:r>
+      <w:r>
+        <w:tab/>
+      </w:r>
+      <w:r>
+        <w:tab/>
+      </w:r>
+      <w:r>
+        <w:tab/>
+      </w:r>
+      <w:r>
+        <w:tab/>
+      </w:r>
+      <w:r>
+        <w:tab/>
+      </w:r>
+      <w:r>
+        <w:tab/>
+      </w:r>
+      <w:r>
+        <w:tab/>
+      </w:r>
+      <w:r>
+        <w:tab/>
+      </w:r>
+      <w:r>
+        <w:tab/>
+      </w:r>
+      <w:r>
+        <w:tab/>
+      </w:r>
+      <w:r>
+        <w:tab/>
+      </w:r>
+      <w:r>
+        <w:tab/>
+      </w:r>
+      <w:r>
+        <w:tab/>
+      </w:r>
+      <w:r>
+        <w:tab/>
+      </w:r>
+      <w:r>
+        <w:tab/>
+      </w:r>
+      <w:r>
+        <w:tab/>
+      </w:r>
+      <w:r>
+        <w:tab/>
+      </w:r>
+      <w:r>
+        <w:tab/>
+      </w:r>
+      <w:r>
+        <w:tab/>
+      </w:r>
+      <w:r>
+        <w:tab/>
+      </w:r>
+      <w:r>
+        <w:tab/>
+      </w:r>
+      <w:r>
+        <w:tab/>
+      </w:r>
+      <w:r>
+        <w:tab/>
+      </w:r>
+      <w:r>
+        <w:tab/>
+      </w:r>
+      <w:r>
+        <w:tab/>
+      </w:r>
+      <w:r>
+        <w:tab/>
+      </w:r>
+      <w:r>
+        <w:tab/>
+      </w:r>
+      <w:r>
+        <w:tab/>
+      </w:r>
+      <w:r>
+        <w:tab/>
+      </w:r>
+      <w:r>
+        <w:tab/>
+      </w:r>
+      <w:r>
+        <w:tab/>
+      </w:r>
+      <w:r>
+        <w:tab/>
+      </w:r>
+      <w:r>
+        <w:tab/>
+      </w:r>
+      <w:r>
+        <w:tab/>
+      </w:r>
+      <w:r>
+        <w:tab/>
+      </w:r>
+      <w:r>
+        <w:tab/>
+      </w:r>
+      <w:r>
+        <w:tab/>
+      </w:r>
+      <w:r>
+        <w:tab/>
+      </w:r>
+      <w:r>
+        <w:tab/>
+      </w:r>
+      <w:r>
+        <w:tab/>
+      </w:r>
+      <w:r>
+        <w:tab/>
+      </w:r>
+      <w:r>
+        <w:tab/>
+      </w:r>
+      <w:r>
+        <w:tab/>
+      </w:r>
+      <w:r>
+        <w:tab/>
+      </w:r>
+      <w:r>
+        <w:tab/>
+      </w:r>
+      <w:r>
+        <w:tab/>
+      </w:r>
+      <w:r>
+        <w:tab/>
+      </w:r>
+      <w:r>
+        <w:tab/>
+      </w:r>
+      <w:r>
+        <w:tab/>
+      </w:r>
+      <w:r>
+        <w:tab/>
+      </w:r>
+      <w:r>
+        <w:tab/>
+      </w:r>
+      <w:r>
+        <w:tab/>
+      </w:r>
+      <w:r>
+        <w:tab/>
+      </w:r>
+      <w:r>
+        <w:tab/>
+      </w:r>
+      <w:r>
+        <w:tab/>
+      </w:r>
+      <w:r>
+        <w:tab/>
+      </w:r>
+      <w:r>
+        <w:tab/>
+      </w:r>
+      <w:r>
+        <w:tab/>
+      </w:r>
+      <w:r>
+        <w:tab/>
+      </w:r>
+      <w:r>
+        <w:tab/>
+      </w:r>
+      <w:r>
+        <w:tab/>
+      </w:r>
+      <w:r>
+        <w:tab/>
+      </w:r>
+      <w:r>
+        <w:tab/>
+      </w:r>
+      <w:r>
+        <w:tab/>
+      </w:r>
+      <w:r>
+        <w:tab/>
+      </w:r>
+      <w:r>
+        <w:tab/>
+      </w:r>
+      <w:r>
+        <w:tab/>
+      </w:r>
+      <w:r>
+        <w:tab/>
+      </w:r>
+      <w:r>
+        <w:tab/>
+      </w:r>
+      <w:r>
+        <w:tab/>
+      </w:r>
+      <w:r>
+        <w:tab/>
+      </w:r>
+      <w:r>
+        <w:tab/>
+      </w:r>
+      <w:r>
+        <w:tab/>
+      </w:r>
+      <w:r>
+        <w:tab/>
+      </w:r>
+      <w:r>
+        <w:tab/>
+      </w:r>
+      <w:r>
+        <w:tab/>
+      </w:r>
+      <w:r>
+        <w:tab/>
+      </w:r>
+      <w:r>
+        <w:tab/>
+      </w:r>
+      <w:r>
+        <w:tab/>
+      </w:r>
+      <w:r>
+        <w:tab/>
+      </w:r>
+      <w:r>
+        <w:tab/>
+      </w:r>
+      <w:r>
+        <w:tab/>
+      </w:r>
+      <w:r>
+        <w:tab/>
+      </w:r>
+      <w:r>
+        <w:tab/>
+      </w:r>
+      <w:r>
+        <w:tab/>
+      </w:r>
+      <w:r>
+        <w:tab/>
+      </w:r>
+      <w:r>
+        <w:tab/>
+      </w:r>
+      <w:r>
+        <w:tab/>
+      </w:r>
+      <w:r>
+        <w:tab/>
+      </w:r>
+      <w:r>
+        <w:tab/>
+      </w:r>
+      <w:r>
+        <w:tab/>
+      </w:r>
+      <w:r>
+        <w:tab/>
+      </w:r>
+      <w:r>
+        <w:tab/>
+      </w:r>
+      <w:r>
+        <w:tab/>
+      </w:r>
+      <w:r>
+        <w:tab/>
+      </w:r>
+      <w:r>
+        <w:tab/>
+      </w:r>
+      <w:r>
+        <w:tab/>
+      </w:r>
+      <w:r>
+        <w:tab/>
+      </w:r>
+      <w:r>
+        <w:tab/>
+      </w:r>
+      <w:r>
+        <w:tab/>
+      </w:r>
+      <w:r>
+        <w:tab/>
+      </w:r>
+      <w:r>
+        <w:tab/>
+      </w:r>
+      <w:r>
+        <w:tab/>
+      </w:r>
+      <w:r>
+        <w:tab/>
+      </w:r>
+      <w:r>
+        <w:tab/>
+      </w:r>
+      <w:r>
+        <w:tab/>
+      </w:r>
+      <w:r>
+        <w:tab/>
+      </w:r>
+      <w:r>
+        <w:tab/>
+      </w:r>
+      <w:r>
+        <w:tab/>
+      </w:r>
+      <w:r>
+        <w:tab/>
+      </w:r>
+      <w:r>
+        <w:tab/>
+      </w:r>
+      <w:r>
+        <w:tab/>
+      </w:r>
+      <w:r>
+        <w:tab/>
+      </w:r>
+      <w:r>
+        <w:tab/>
+      </w:r>
+      <w:r>
+        <w:tab/>
+      </w:r>
+      <w:r>
+        <w:tab/>
+      </w:r>
+      <w:r>
+        <w:tab/>
+      </w:r>
+      <w:r>
+        <w:tab/>
+      </w:r>
+      <w:r>
+        <w:tab/>
+      </w:r>
+      <w:r>
+        <w:tab/>
+      </w:r>
+      <w:r>
+        <w:tab/>
+      </w:r>
+      <w:r>
+        <w:tab/>
+      </w:r>
+      <w:r>
+        <w:tab/>
+      </w:r>
+      <w:r>
+        <w:tab/>
+      </w:r>
+      <w:r>
+        <w:tab/>
+      </w:r>
+      <w:r>
+        <w:tab/>
+      </w:r>
+      <w:r>
+        <w:tab/>
+      </w:r>
+      <w:r>
+        <w:tab/>
+      </w:r>
+      <w:r>
+        <w:tab/>
+      </w:r>
+      <w:r>
+        <w:tab/>
+      </w:r>
+      <w:r>
+        <w:tab/>
+      </w:r>
+      <w:r>
+        <w:tab/>
+      </w:r>
+      <w:r>
+        <w:tab/>
+      </w:r>
+      <w:r>
+        <w:tab/>
+      </w:r>
+      <w:r>
+        <w:tab/>
+      </w:r>
+      <w:r>
+        <w:tab/>
+      </w:r>
+      <w:r>
+        <w:tab/>
+      </w:r>
+      <w:r>
+        <w:tab/>
+      </w:r>
+      <w:r>
+        <w:tab/>
+      </w:r>
+      <w:r>
+        <w:tab/>
+      </w:r>
+      <w:r>
+        <w:tab/>
+      </w:r>
+      <w:r>
+        <w:tab/>
+      </w:r>
+      <w:r>
+        <w:tab/>
+      </w:r>
+      <w:r>
+        <w:tab/>
+      </w:r>
+      <w:r>
+        <w:tab/>
+      </w:r>
+      <w:r>
+        <w:tab/>
+      </w:r>
+      <w:r>
+        <w:tab/>
+      </w:r>
+      <w:r>
+        <w:tab/>
+      </w:r>
+      <w:r>
+        <w:tab/>
+      </w:r>
+      <w:r>
+        <w:tab/>
+      </w:r>
+      <w:r>
+        <w:tab/>
+      </w:r>
+      <w:r>
+        <w:tab/>
+      </w:r>
+      <w:r>
+        <w:tab/>
+      </w:r>
+      <w:r>
+        <w:tab/>
+      </w:r>
+      <w:r>
+        <w:tab/>
+      </w:r>
+      <w:r>
+        <w:tab/>
+      </w:r>
+      <w:r>
+        <w:tab/>
+      </w:r>
+      <w:r>
+        <w:tab/>
+      </w:r>
+      <w:r>
+        <w:tab/>
+      </w:r>
+      <w:r>
+        <w:tab/>
+      </w:r>
+      <w:r>
+        <w:tab/>
+      </w:r>
+      <w:r>
+        <w:tab/>
+      </w:r>
+      <w:r>
+        <w:tab/>
+      </w:r>
+      <w:r>
+        <w:tab/>
+      </w:r>
+      <w:r>
+        <w:tab/>
+      </w:r>
+      <w:r>
+        <w:tab/>
+      </w:r>
+      <w:r>
+        <w:tab/>
+      </w:r>
+      <w:r>
+        <w:tab/>
+      </w:r>
+      <w:r>
+        <w:tab/>
+      </w:r>
+      <w:r>
+        <w:tab/>
+      </w:r>
+      <w:r>
+        <w:tab/>
+      </w:r>
+    </w:p>
+    <w:p>
+      <w:r>
+        <w:tab/>
+      </w:r>
+    </w:p>
+    <w:p>
+      <w:r>
+        <w:tab/>
+      </w:r>
+      <w:r>
+        <w:tab/>
+      </w:r>
+      <w:r>
+        <w:tab/>
+      </w:r>
+      <w:r>
+        <w:tab/>
+      </w:r>
+      <w:r>
+        <w:tab/>
+      </w:r>
+      <w:r>
+        <w:tab/>
+      </w:r>
+      <w:r>
+        <w:tab/>
+      </w:r>
+      <w:r>
+        <w:tab/>
+      </w:r>
+      <w:r>
+        <w:tab/>
+      </w:r>
+      <w:r>
+        <w:tab/>
+      </w:r>
+      <w:r>
+        <w:tab/>
       </w:r>
     </w:p>
     <w:sectPr>

</xml_diff>

<commit_message>
again modify class diagram and er diagram
</commit_message>
<xml_diff>
--- a/Sheheryar_SDS Document Diagram.docx
+++ b/Sheheryar_SDS Document Diagram.docx
@@ -17313,7 +17313,7 @@
           <w:noProof/>
         </w:rPr>
         <w:drawing>
-          <wp:anchor distT="0" distB="0" distL="114300" distR="114300" simplePos="0" relativeHeight="251676672" behindDoc="0" locked="0" layoutInCell="1" allowOverlap="1" wp14:anchorId="3587862D" wp14:editId="76790569">
+          <wp:anchor distT="0" distB="0" distL="114300" distR="114300" simplePos="0" relativeHeight="251678720" behindDoc="0" locked="0" layoutInCell="1" allowOverlap="1" wp14:anchorId="56E8ABF4" wp14:editId="5392ECDE">
             <wp:simplePos x="0" y="0"/>
             <wp:positionH relativeFrom="column">
               <wp:posOffset>0</wp:posOffset>
@@ -17321,10 +17321,10 @@
             <wp:positionV relativeFrom="paragraph">
               <wp:posOffset>-635</wp:posOffset>
             </wp:positionV>
-            <wp:extent cx="5943600" cy="4911725"/>
-            <wp:effectExtent l="0" t="0" r="0" b="3175"/>
+            <wp:extent cx="5943600" cy="3126105"/>
+            <wp:effectExtent l="0" t="0" r="0" b="0"/>
             <wp:wrapNone/>
-            <wp:docPr id="306041256" name="Picture 1"/>
+            <wp:docPr id="1829264943" name="Graphic 5"/>
             <wp:cNvGraphicFramePr>
               <a:graphicFrameLocks xmlns:a="http://schemas.openxmlformats.org/drawingml/2006/main" noChangeAspect="1"/>
             </wp:cNvGraphicFramePr>
@@ -17332,11 +17332,941 @@
               <a:graphicData uri="http://schemas.openxmlformats.org/drawingml/2006/picture">
                 <pic:pic xmlns:pic="http://schemas.openxmlformats.org/drawingml/2006/picture">
                   <pic:nvPicPr>
-                    <pic:cNvPr id="306041256" name="Picture 306041256"/>
+                    <pic:cNvPr id="1829264943" name="Graphic 1829264943"/>
                     <pic:cNvPicPr/>
                   </pic:nvPicPr>
                   <pic:blipFill>
-                    <a:blip r:embed="rId21" cstate="print">
+                    <a:blip r:embed="rId21">
+                      <a:extLst>
+                        <a:ext uri="{96DAC541-7B7A-43D3-8B79-37D633B846F1}">
+                          <asvg:svgBlip xmlns:asvg="http://schemas.microsoft.com/office/drawing/2016/SVG/main" r:embed="rId22"/>
+                        </a:ext>
+                      </a:extLst>
+                    </a:blip>
+                    <a:stretch>
+                      <a:fillRect/>
+                    </a:stretch>
+                  </pic:blipFill>
+                  <pic:spPr>
+                    <a:xfrm>
+                      <a:off x="0" y="0"/>
+                      <a:ext cx="5943600" cy="3126105"/>
+                    </a:xfrm>
+                    <a:prstGeom prst="rect">
+                      <a:avLst/>
+                    </a:prstGeom>
+                  </pic:spPr>
+                </pic:pic>
+              </a:graphicData>
+            </a:graphic>
+          </wp:anchor>
+        </w:drawing>
+      </w:r>
+      <w:r>
+        <w:tab/>
+      </w:r>
+      <w:r>
+        <w:tab/>
+      </w:r>
+      <w:r>
+        <w:tab/>
+      </w:r>
+      <w:r>
+        <w:tab/>
+      </w:r>
+      <w:r>
+        <w:tab/>
+      </w:r>
+      <w:r>
+        <w:tab/>
+      </w:r>
+      <w:r>
+        <w:tab/>
+      </w:r>
+      <w:r>
+        <w:tab/>
+      </w:r>
+      <w:r>
+        <w:tab/>
+      </w:r>
+      <w:r>
+        <w:tab/>
+      </w:r>
+      <w:r>
+        <w:tab/>
+      </w:r>
+      <w:r>
+        <w:tab/>
+      </w:r>
+      <w:r>
+        <w:tab/>
+      </w:r>
+      <w:r>
+        <w:tab/>
+      </w:r>
+      <w:r>
+        <w:tab/>
+      </w:r>
+      <w:r>
+        <w:tab/>
+      </w:r>
+      <w:r>
+        <w:tab/>
+      </w:r>
+      <w:r>
+        <w:tab/>
+      </w:r>
+      <w:r>
+        <w:tab/>
+      </w:r>
+      <w:r>
+        <w:tab/>
+      </w:r>
+      <w:r>
+        <w:tab/>
+      </w:r>
+      <w:r>
+        <w:tab/>
+      </w:r>
+      <w:r>
+        <w:tab/>
+      </w:r>
+      <w:r>
+        <w:tab/>
+      </w:r>
+      <w:r>
+        <w:tab/>
+      </w:r>
+      <w:r>
+        <w:tab/>
+      </w:r>
+      <w:r>
+        <w:tab/>
+      </w:r>
+      <w:r>
+        <w:tab/>
+      </w:r>
+      <w:r>
+        <w:tab/>
+      </w:r>
+      <w:r>
+        <w:tab/>
+      </w:r>
+      <w:r>
+        <w:tab/>
+      </w:r>
+      <w:r>
+        <w:tab/>
+      </w:r>
+      <w:r>
+        <w:tab/>
+      </w:r>
+      <w:r>
+        <w:tab/>
+      </w:r>
+      <w:r>
+        <w:tab/>
+      </w:r>
+      <w:r>
+        <w:tab/>
+      </w:r>
+      <w:r>
+        <w:tab/>
+      </w:r>
+      <w:r>
+        <w:tab/>
+      </w:r>
+      <w:r>
+        <w:tab/>
+      </w:r>
+      <w:r>
+        <w:tab/>
+      </w:r>
+      <w:r>
+        <w:tab/>
+      </w:r>
+      <w:r>
+        <w:tab/>
+      </w:r>
+      <w:r>
+        <w:tab/>
+      </w:r>
+      <w:r>
+        <w:tab/>
+      </w:r>
+      <w:r>
+        <w:tab/>
+      </w:r>
+      <w:r>
+        <w:tab/>
+      </w:r>
+      <w:r>
+        <w:tab/>
+      </w:r>
+      <w:r>
+        <w:tab/>
+      </w:r>
+      <w:r>
+        <w:tab/>
+      </w:r>
+      <w:r>
+        <w:tab/>
+      </w:r>
+      <w:r>
+        <w:tab/>
+      </w:r>
+      <w:r>
+        <w:tab/>
+      </w:r>
+      <w:r>
+        <w:tab/>
+      </w:r>
+      <w:r>
+        <w:tab/>
+      </w:r>
+      <w:r>
+        <w:tab/>
+      </w:r>
+      <w:r>
+        <w:tab/>
+      </w:r>
+      <w:r>
+        <w:tab/>
+      </w:r>
+      <w:r>
+        <w:tab/>
+      </w:r>
+      <w:r>
+        <w:tab/>
+      </w:r>
+      <w:r>
+        <w:tab/>
+      </w:r>
+      <w:r>
+        <w:tab/>
+      </w:r>
+      <w:r>
+        <w:tab/>
+      </w:r>
+      <w:r>
+        <w:tab/>
+      </w:r>
+      <w:r>
+        <w:tab/>
+      </w:r>
+      <w:r>
+        <w:tab/>
+      </w:r>
+      <w:r>
+        <w:tab/>
+      </w:r>
+      <w:r>
+        <w:tab/>
+      </w:r>
+      <w:r>
+        <w:tab/>
+      </w:r>
+      <w:r>
+        <w:tab/>
+      </w:r>
+      <w:r>
+        <w:tab/>
+      </w:r>
+      <w:r>
+        <w:tab/>
+      </w:r>
+      <w:r>
+        <w:tab/>
+      </w:r>
+      <w:r>
+        <w:tab/>
+      </w:r>
+      <w:r>
+        <w:tab/>
+      </w:r>
+      <w:r>
+        <w:tab/>
+      </w:r>
+      <w:r>
+        <w:tab/>
+      </w:r>
+      <w:r>
+        <w:tab/>
+      </w:r>
+      <w:r>
+        <w:tab/>
+      </w:r>
+      <w:r>
+        <w:tab/>
+      </w:r>
+      <w:r>
+        <w:tab/>
+      </w:r>
+      <w:r>
+        <w:tab/>
+      </w:r>
+      <w:r>
+        <w:tab/>
+      </w:r>
+      <w:r>
+        <w:tab/>
+      </w:r>
+      <w:r>
+        <w:tab/>
+      </w:r>
+      <w:r>
+        <w:tab/>
+      </w:r>
+      <w:r>
+        <w:tab/>
+      </w:r>
+      <w:r>
+        <w:tab/>
+      </w:r>
+      <w:r>
+        <w:tab/>
+      </w:r>
+      <w:r>
+        <w:tab/>
+      </w:r>
+      <w:r>
+        <w:tab/>
+      </w:r>
+      <w:r>
+        <w:tab/>
+      </w:r>
+      <w:r>
+        <w:tab/>
+      </w:r>
+      <w:r>
+        <w:tab/>
+      </w:r>
+      <w:r>
+        <w:tab/>
+      </w:r>
+      <w:r>
+        <w:tab/>
+      </w:r>
+      <w:r>
+        <w:tab/>
+      </w:r>
+      <w:r>
+        <w:tab/>
+      </w:r>
+      <w:r>
+        <w:tab/>
+      </w:r>
+      <w:r>
+        <w:tab/>
+      </w:r>
+      <w:r>
+        <w:tab/>
+      </w:r>
+      <w:r>
+        <w:tab/>
+      </w:r>
+      <w:r>
+        <w:tab/>
+      </w:r>
+      <w:r>
+        <w:tab/>
+      </w:r>
+      <w:r>
+        <w:tab/>
+      </w:r>
+      <w:r>
+        <w:tab/>
+      </w:r>
+      <w:r>
+        <w:tab/>
+      </w:r>
+      <w:r>
+        <w:tab/>
+      </w:r>
+      <w:r>
+        <w:tab/>
+      </w:r>
+      <w:r>
+        <w:tab/>
+      </w:r>
+      <w:r>
+        <w:tab/>
+      </w:r>
+      <w:r>
+        <w:tab/>
+      </w:r>
+      <w:r>
+        <w:tab/>
+      </w:r>
+      <w:r>
+        <w:tab/>
+      </w:r>
+      <w:r>
+        <w:tab/>
+      </w:r>
+      <w:r>
+        <w:tab/>
+      </w:r>
+      <w:r>
+        <w:tab/>
+      </w:r>
+      <w:r>
+        <w:tab/>
+      </w:r>
+      <w:r>
+        <w:tab/>
+      </w:r>
+      <w:r>
+        <w:tab/>
+      </w:r>
+      <w:r>
+        <w:tab/>
+      </w:r>
+      <w:r>
+        <w:tab/>
+      </w:r>
+      <w:r>
+        <w:tab/>
+      </w:r>
+      <w:r>
+        <w:tab/>
+      </w:r>
+      <w:r>
+        <w:tab/>
+      </w:r>
+      <w:r>
+        <w:tab/>
+      </w:r>
+      <w:r>
+        <w:tab/>
+      </w:r>
+      <w:r>
+        <w:tab/>
+      </w:r>
+      <w:r>
+        <w:tab/>
+      </w:r>
+      <w:r>
+        <w:tab/>
+      </w:r>
+      <w:r>
+        <w:tab/>
+      </w:r>
+      <w:r>
+        <w:tab/>
+      </w:r>
+      <w:r>
+        <w:tab/>
+      </w:r>
+      <w:r>
+        <w:tab/>
+      </w:r>
+      <w:r>
+        <w:tab/>
+      </w:r>
+      <w:r>
+        <w:tab/>
+      </w:r>
+      <w:r>
+        <w:tab/>
+      </w:r>
+      <w:r>
+        <w:tab/>
+      </w:r>
+      <w:r>
+        <w:tab/>
+      </w:r>
+      <w:r>
+        <w:tab/>
+      </w:r>
+      <w:r>
+        <w:tab/>
+      </w:r>
+      <w:r>
+        <w:tab/>
+      </w:r>
+      <w:r>
+        <w:tab/>
+      </w:r>
+      <w:r>
+        <w:tab/>
+      </w:r>
+      <w:r>
+        <w:tab/>
+      </w:r>
+      <w:r>
+        <w:tab/>
+      </w:r>
+      <w:r>
+        <w:tab/>
+      </w:r>
+      <w:r>
+        <w:tab/>
+      </w:r>
+      <w:r>
+        <w:tab/>
+      </w:r>
+      <w:r>
+        <w:tab/>
+      </w:r>
+      <w:r>
+        <w:tab/>
+      </w:r>
+      <w:r>
+        <w:tab/>
+      </w:r>
+      <w:r>
+        <w:tab/>
+      </w:r>
+      <w:r>
+        <w:tab/>
+      </w:r>
+      <w:r>
+        <w:tab/>
+      </w:r>
+      <w:r>
+        <w:tab/>
+      </w:r>
+      <w:r>
+        <w:tab/>
+      </w:r>
+      <w:r>
+        <w:tab/>
+      </w:r>
+      <w:r>
+        <w:tab/>
+      </w:r>
+      <w:r>
+        <w:tab/>
+      </w:r>
+      <w:r>
+        <w:tab/>
+      </w:r>
+      <w:r>
+        <w:tab/>
+      </w:r>
+      <w:r>
+        <w:tab/>
+      </w:r>
+      <w:r>
+        <w:tab/>
+      </w:r>
+      <w:r>
+        <w:tab/>
+      </w:r>
+      <w:r>
+        <w:tab/>
+      </w:r>
+      <w:r>
+        <w:tab/>
+      </w:r>
+      <w:r>
+        <w:tab/>
+      </w:r>
+      <w:r>
+        <w:tab/>
+      </w:r>
+      <w:r>
+        <w:tab/>
+      </w:r>
+      <w:r>
+        <w:tab/>
+      </w:r>
+      <w:r>
+        <w:tab/>
+      </w:r>
+      <w:r>
+        <w:tab/>
+      </w:r>
+      <w:r>
+        <w:tab/>
+      </w:r>
+      <w:r>
+        <w:tab/>
+      </w:r>
+      <w:r>
+        <w:tab/>
+      </w:r>
+      <w:r>
+        <w:tab/>
+      </w:r>
+      <w:r>
+        <w:tab/>
+      </w:r>
+      <w:r>
+        <w:tab/>
+      </w:r>
+      <w:r>
+        <w:tab/>
+      </w:r>
+      <w:r>
+        <w:tab/>
+      </w:r>
+      <w:r>
+        <w:tab/>
+      </w:r>
+      <w:r>
+        <w:tab/>
+      </w:r>
+      <w:r>
+        <w:tab/>
+      </w:r>
+      <w:r>
+        <w:tab/>
+      </w:r>
+      <w:r>
+        <w:tab/>
+      </w:r>
+      <w:r>
+        <w:tab/>
+      </w:r>
+      <w:r>
+        <w:tab/>
+      </w:r>
+      <w:r>
+        <w:tab/>
+      </w:r>
+      <w:r>
+        <w:tab/>
+      </w:r>
+      <w:r>
+        <w:tab/>
+      </w:r>
+      <w:r>
+        <w:tab/>
+      </w:r>
+      <w:r>
+        <w:tab/>
+      </w:r>
+      <w:r>
+        <w:tab/>
+      </w:r>
+      <w:r>
+        <w:tab/>
+      </w:r>
+      <w:r>
+        <w:tab/>
+      </w:r>
+      <w:r>
+        <w:tab/>
+      </w:r>
+      <w:r>
+        <w:tab/>
+      </w:r>
+      <w:r>
+        <w:tab/>
+      </w:r>
+      <w:r>
+        <w:tab/>
+      </w:r>
+      <w:r>
+        <w:tab/>
+      </w:r>
+      <w:r>
+        <w:tab/>
+      </w:r>
+      <w:r>
+        <w:tab/>
+      </w:r>
+      <w:r>
+        <w:tab/>
+      </w:r>
+      <w:r>
+        <w:tab/>
+      </w:r>
+      <w:r>
+        <w:tab/>
+      </w:r>
+      <w:r>
+        <w:tab/>
+      </w:r>
+      <w:r>
+        <w:tab/>
+      </w:r>
+      <w:r>
+        <w:tab/>
+      </w:r>
+      <w:r>
+        <w:tab/>
+      </w:r>
+      <w:r>
+        <w:tab/>
+      </w:r>
+      <w:r>
+        <w:tab/>
+      </w:r>
+      <w:r>
+        <w:tab/>
+      </w:r>
+      <w:r>
+        <w:tab/>
+      </w:r>
+      <w:r>
+        <w:tab/>
+      </w:r>
+      <w:r>
+        <w:tab/>
+      </w:r>
+      <w:r>
+        <w:tab/>
+      </w:r>
+      <w:r>
+        <w:tab/>
+      </w:r>
+      <w:r>
+        <w:tab/>
+      </w:r>
+      <w:r>
+        <w:tab/>
+      </w:r>
+      <w:r>
+        <w:tab/>
+      </w:r>
+      <w:r>
+        <w:tab/>
+      </w:r>
+    </w:p>
+    <w:p>
+      <w:r>
+        <w:tab/>
+      </w:r>
+      <w:r>
+        <w:tab/>
+      </w:r>
+      <w:r>
+        <w:tab/>
+      </w:r>
+      <w:r>
+        <w:tab/>
+      </w:r>
+      <w:r>
+        <w:tab/>
+      </w:r>
+      <w:r>
+        <w:tab/>
+      </w:r>
+      <w:r>
+        <w:tab/>
+      </w:r>
+      <w:r>
+        <w:tab/>
+      </w:r>
+      <w:r>
+        <w:tab/>
+      </w:r>
+      <w:r>
+        <w:tab/>
+      </w:r>
+      <w:r>
+        <w:tab/>
+      </w:r>
+      <w:r>
+        <w:tab/>
+      </w:r>
+      <w:r>
+        <w:tab/>
+      </w:r>
+      <w:r>
+        <w:tab/>
+      </w:r>
+      <w:r>
+        <w:tab/>
+      </w:r>
+      <w:r>
+        <w:tab/>
+      </w:r>
+      <w:r>
+        <w:tab/>
+      </w:r>
+      <w:r>
+        <w:tab/>
+      </w:r>
+      <w:r>
+        <w:tab/>
+      </w:r>
+      <w:r>
+        <w:tab/>
+      </w:r>
+      <w:r>
+        <w:tab/>
+      </w:r>
+      <w:r>
+        <w:tab/>
+      </w:r>
+      <w:r>
+        <w:tab/>
+      </w:r>
+      <w:r>
+        <w:tab/>
+      </w:r>
+      <w:r>
+        <w:tab/>
+      </w:r>
+      <w:r>
+        <w:tab/>
+      </w:r>
+      <w:r>
+        <w:tab/>
+      </w:r>
+      <w:r>
+        <w:tab/>
+      </w:r>
+      <w:r>
+        <w:tab/>
+      </w:r>
+      <w:r>
+        <w:tab/>
+      </w:r>
+      <w:r>
+        <w:tab/>
+      </w:r>
+      <w:r>
+        <w:tab/>
+      </w:r>
+      <w:r>
+        <w:tab/>
+      </w:r>
+      <w:r>
+        <w:tab/>
+      </w:r>
+      <w:r>
+        <w:tab/>
+      </w:r>
+      <w:r>
+        <w:tab/>
+      </w:r>
+      <w:r>
+        <w:tab/>
+      </w:r>
+      <w:r>
+        <w:tab/>
+      </w:r>
+      <w:r>
+        <w:tab/>
+      </w:r>
+      <w:r>
+        <w:tab/>
+      </w:r>
+      <w:r>
+        <w:tab/>
+      </w:r>
+      <w:r>
+        <w:tab/>
+      </w:r>
+      <w:r>
+        <w:tab/>
+      </w:r>
+      <w:r>
+        <w:tab/>
+      </w:r>
+      <w:r>
+        <w:tab/>
+      </w:r>
+      <w:r>
+        <w:tab/>
+      </w:r>
+      <w:r>
+        <w:tab/>
+      </w:r>
+      <w:r>
+        <w:tab/>
+      </w:r>
+      <w:r>
+        <w:tab/>
+      </w:r>
+      <w:r>
+        <w:tab/>
+      </w:r>
+      <w:r>
+        <w:tab/>
+      </w:r>
+      <w:r>
+        <w:tab/>
+      </w:r>
+      <w:r>
+        <w:tab/>
+      </w:r>
+      <w:r>
+        <w:tab/>
+      </w:r>
+      <w:r>
+        <w:tab/>
+      </w:r>
+      <w:r>
+        <w:tab/>
+      </w:r>
+      <w:r>
+        <w:tab/>
+      </w:r>
+      <w:r>
+        <w:tab/>
+      </w:r>
+      <w:r>
+        <w:tab/>
+      </w:r>
+      <w:r>
+        <w:tab/>
+      </w:r>
+      <w:r>
+        <w:tab/>
+      </w:r>
+      <w:r>
+        <w:tab/>
+      </w:r>
+      <w:r>
+        <w:tab/>
+      </w:r>
+      <w:r>
+        <w:tab/>
+      </w:r>
+      <w:r>
+        <w:tab/>
+      </w:r>
+    </w:p>
+    <w:p/>
+    <w:p>
+      <w:r>
+        <w:br w:type="page"/>
+      </w:r>
+    </w:p>
+    <w:p>
+      <w:pPr>
+        <w:pStyle w:val="Heading1"/>
+      </w:pPr>
+      <w:r>
+        <w:t>ER Diagram</w:t>
+      </w:r>
+    </w:p>
+    <w:p>
+      <w:r>
+        <w:rPr>
+          <w:noProof/>
+        </w:rPr>
+        <w:drawing>
+          <wp:anchor distT="0" distB="0" distL="114300" distR="114300" simplePos="0" relativeHeight="251677696" behindDoc="0" locked="0" layoutInCell="1" allowOverlap="1" wp14:anchorId="743962FB" wp14:editId="30DEBD01">
+            <wp:simplePos x="0" y="0"/>
+            <wp:positionH relativeFrom="column">
+              <wp:posOffset>0</wp:posOffset>
+            </wp:positionH>
+            <wp:positionV relativeFrom="paragraph">
+              <wp:posOffset>-635</wp:posOffset>
+            </wp:positionV>
+            <wp:extent cx="5943600" cy="2349500"/>
+            <wp:effectExtent l="0" t="0" r="0" b="0"/>
+            <wp:wrapNone/>
+            <wp:docPr id="979358436" name="Picture 3"/>
+            <wp:cNvGraphicFramePr>
+              <a:graphicFrameLocks xmlns:a="http://schemas.openxmlformats.org/drawingml/2006/main" noChangeAspect="1"/>
+            </wp:cNvGraphicFramePr>
+            <a:graphic xmlns:a="http://schemas.openxmlformats.org/drawingml/2006/main">
+              <a:graphicData uri="http://schemas.openxmlformats.org/drawingml/2006/picture">
+                <pic:pic xmlns:pic="http://schemas.openxmlformats.org/drawingml/2006/picture">
+                  <pic:nvPicPr>
+                    <pic:cNvPr id="979358436" name="Picture 979358436"/>
+                    <pic:cNvPicPr/>
+                  </pic:nvPicPr>
+                  <pic:blipFill>
+                    <a:blip r:embed="rId23" cstate="print">
                       <a:extLst>
                         <a:ext uri="{28A0092B-C50C-407E-A947-70E740481C1C}">
                           <a14:useLocalDpi xmlns:a14="http://schemas.microsoft.com/office/drawing/2010/main" val="0"/>
@@ -17350,7 +18280,7 @@
                   <pic:spPr>
                     <a:xfrm>
                       <a:off x="0" y="0"/>
-                      <a:ext cx="5943600" cy="4911725"/>
+                      <a:ext cx="5943600" cy="2349500"/>
                     </a:xfrm>
                     <a:prstGeom prst="rect">
                       <a:avLst/>
@@ -17908,365 +18838,35 @@
       <w:r>
         <w:tab/>
       </w:r>
-      <w:r>
-        <w:tab/>
-      </w:r>
-      <w:r>
-        <w:tab/>
-      </w:r>
-      <w:r>
-        <w:tab/>
-      </w:r>
-      <w:r>
-        <w:tab/>
-      </w:r>
-      <w:r>
-        <w:tab/>
-      </w:r>
-      <w:r>
-        <w:tab/>
-      </w:r>
-      <w:r>
-        <w:tab/>
-      </w:r>
-      <w:r>
-        <w:tab/>
-      </w:r>
-      <w:r>
-        <w:tab/>
-      </w:r>
-      <w:r>
-        <w:tab/>
-      </w:r>
-      <w:r>
-        <w:tab/>
-      </w:r>
-      <w:r>
-        <w:tab/>
-      </w:r>
-      <w:r>
-        <w:tab/>
-      </w:r>
-      <w:r>
-        <w:tab/>
-      </w:r>
-      <w:r>
-        <w:tab/>
-      </w:r>
-      <w:r>
-        <w:tab/>
-      </w:r>
-      <w:r>
-        <w:tab/>
-      </w:r>
-      <w:r>
-        <w:tab/>
-      </w:r>
-      <w:r>
-        <w:tab/>
-      </w:r>
-      <w:r>
-        <w:tab/>
-      </w:r>
-      <w:r>
-        <w:tab/>
-      </w:r>
-      <w:r>
-        <w:tab/>
-      </w:r>
-      <w:r>
-        <w:tab/>
-      </w:r>
-      <w:r>
-        <w:tab/>
-      </w:r>
-      <w:r>
-        <w:tab/>
-      </w:r>
-      <w:r>
-        <w:tab/>
-      </w:r>
-      <w:r>
-        <w:tab/>
-      </w:r>
-      <w:r>
-        <w:tab/>
-      </w:r>
-      <w:r>
-        <w:tab/>
-      </w:r>
-      <w:r>
-        <w:tab/>
-      </w:r>
-      <w:r>
-        <w:tab/>
-      </w:r>
-      <w:r>
-        <w:tab/>
-      </w:r>
-      <w:r>
-        <w:tab/>
-      </w:r>
-      <w:r>
-        <w:tab/>
-      </w:r>
-      <w:r>
-        <w:tab/>
-      </w:r>
-      <w:r>
-        <w:tab/>
-      </w:r>
-      <w:r>
-        <w:tab/>
-      </w:r>
-      <w:r>
-        <w:tab/>
-      </w:r>
-      <w:r>
-        <w:tab/>
-      </w:r>
-      <w:r>
-        <w:tab/>
-      </w:r>
-      <w:r>
-        <w:tab/>
-      </w:r>
-      <w:r>
-        <w:tab/>
-      </w:r>
-      <w:r>
-        <w:tab/>
-      </w:r>
-      <w:r>
-        <w:tab/>
-      </w:r>
-      <w:r>
-        <w:tab/>
-      </w:r>
-      <w:r>
-        <w:tab/>
-      </w:r>
-      <w:r>
-        <w:tab/>
-      </w:r>
-      <w:r>
-        <w:tab/>
-      </w:r>
-      <w:r>
-        <w:tab/>
-      </w:r>
-      <w:r>
-        <w:tab/>
-      </w:r>
-      <w:r>
-        <w:tab/>
-      </w:r>
-      <w:r>
-        <w:tab/>
-      </w:r>
-      <w:r>
-        <w:tab/>
-      </w:r>
-      <w:r>
-        <w:tab/>
-      </w:r>
-      <w:r>
-        <w:tab/>
-      </w:r>
-      <w:r>
-        <w:tab/>
-      </w:r>
-      <w:r>
-        <w:tab/>
-      </w:r>
-      <w:r>
-        <w:tab/>
-      </w:r>
-      <w:r>
-        <w:tab/>
-      </w:r>
-      <w:r>
-        <w:tab/>
-      </w:r>
-      <w:r>
-        <w:tab/>
-      </w:r>
-      <w:r>
-        <w:tab/>
-      </w:r>
-      <w:r>
-        <w:tab/>
-      </w:r>
-      <w:r>
-        <w:tab/>
-      </w:r>
-      <w:r>
-        <w:tab/>
-      </w:r>
-      <w:r>
-        <w:tab/>
-      </w:r>
-      <w:r>
-        <w:tab/>
-      </w:r>
-      <w:r>
-        <w:tab/>
-      </w:r>
-      <w:r>
-        <w:tab/>
-      </w:r>
-      <w:r>
-        <w:tab/>
-      </w:r>
-      <w:r>
-        <w:tab/>
-      </w:r>
-      <w:r>
-        <w:tab/>
-      </w:r>
-      <w:r>
-        <w:tab/>
-      </w:r>
-      <w:r>
-        <w:tab/>
-      </w:r>
-      <w:r>
-        <w:tab/>
-      </w:r>
-      <w:r>
-        <w:tab/>
-      </w:r>
-      <w:r>
-        <w:tab/>
-      </w:r>
-      <w:r>
-        <w:tab/>
-      </w:r>
-      <w:r>
-        <w:tab/>
-      </w:r>
-      <w:r>
-        <w:tab/>
-      </w:r>
-      <w:r>
-        <w:tab/>
-      </w:r>
-      <w:r>
-        <w:tab/>
-      </w:r>
-      <w:r>
-        <w:tab/>
-      </w:r>
-      <w:r>
-        <w:tab/>
-      </w:r>
-      <w:r>
-        <w:tab/>
-      </w:r>
-      <w:r>
-        <w:tab/>
-      </w:r>
-      <w:r>
-        <w:tab/>
-      </w:r>
-      <w:r>
-        <w:tab/>
-      </w:r>
-      <w:r>
-        <w:tab/>
-      </w:r>
-      <w:r>
-        <w:tab/>
-      </w:r>
-      <w:r>
-        <w:tab/>
-      </w:r>
-      <w:r>
-        <w:tab/>
-      </w:r>
-      <w:r>
-        <w:tab/>
-      </w:r>
-      <w:r>
-        <w:tab/>
-      </w:r>
-      <w:r>
-        <w:tab/>
-      </w:r>
-      <w:r>
-        <w:tab/>
-      </w:r>
-      <w:r>
-        <w:tab/>
-      </w:r>
-      <w:r>
-        <w:tab/>
-      </w:r>
-      <w:r>
-        <w:tab/>
-      </w:r>
-      <w:r>
-        <w:tab/>
-      </w:r>
-      <w:r>
-        <w:tab/>
-      </w:r>
-      <w:r>
-        <w:tab/>
-      </w:r>
-      <w:r>
-        <w:tab/>
-      </w:r>
-      <w:r>
-        <w:tab/>
-      </w:r>
-      <w:r>
-        <w:tab/>
-      </w:r>
-      <w:r>
-        <w:tab/>
-      </w:r>
-      <w:r>
-        <w:tab/>
-      </w:r>
-      <w:r>
-        <w:tab/>
-      </w:r>
-      <w:r>
-        <w:tab/>
-      </w:r>
-      <w:r>
-        <w:tab/>
-      </w:r>
-      <w:r>
-        <w:tab/>
-      </w:r>
-      <w:r>
-        <w:tab/>
-      </w:r>
-      <w:r>
-        <w:tab/>
-      </w:r>
-      <w:r>
-        <w:tab/>
-      </w:r>
-      <w:r>
-        <w:tab/>
-      </w:r>
-      <w:r>
-        <w:tab/>
-      </w:r>
-      <w:r>
-        <w:tab/>
-      </w:r>
-      <w:r>
-        <w:tab/>
-      </w:r>
-      <w:r>
-        <w:tab/>
-      </w:r>
     </w:p>
-    <w:p/>
+    <w:p>
+      <w:r>
+        <w:tab/>
+      </w:r>
+    </w:p>
+    <w:p>
+      <w:r>
+        <w:tab/>
+      </w:r>
+      <w:r>
+        <w:tab/>
+      </w:r>
+      <w:r>
+        <w:tab/>
+      </w:r>
+      <w:r>
+        <w:tab/>
+      </w:r>
+      <w:r>
+        <w:tab/>
+      </w:r>
+      <w:r>
+        <w:tab/>
+      </w:r>
+      <w:r>
+        <w:tab/>
+      </w:r>
+    </w:p>
     <w:p>
       <w:r>
         <w:br w:type="page"/>
@@ -18277,638 +18877,7 @@
         <w:pStyle w:val="Heading1"/>
       </w:pPr>
       <w:r>
-        <w:t>ER Diagram</w:t>
-      </w:r>
-    </w:p>
-    <w:p/>
-    <w:p>
-      <w:r>
-        <w:rPr>
-          <w:noProof/>
-        </w:rPr>
-        <w:drawing>
-          <wp:anchor distT="0" distB="0" distL="114300" distR="114300" simplePos="0" relativeHeight="251677696" behindDoc="0" locked="0" layoutInCell="1" allowOverlap="1" wp14:anchorId="76BD7DFB" wp14:editId="3330749B">
-            <wp:simplePos x="0" y="0"/>
-            <wp:positionH relativeFrom="column">
-              <wp:posOffset>0</wp:posOffset>
-            </wp:positionH>
-            <wp:positionV relativeFrom="paragraph">
-              <wp:posOffset>-635</wp:posOffset>
-            </wp:positionV>
-            <wp:extent cx="5943600" cy="2792095"/>
-            <wp:effectExtent l="0" t="0" r="0" b="8255"/>
-            <wp:wrapNone/>
-            <wp:docPr id="2061290952" name="Picture 2"/>
-            <wp:cNvGraphicFramePr>
-              <a:graphicFrameLocks xmlns:a="http://schemas.openxmlformats.org/drawingml/2006/main" noChangeAspect="1"/>
-            </wp:cNvGraphicFramePr>
-            <a:graphic xmlns:a="http://schemas.openxmlformats.org/drawingml/2006/main">
-              <a:graphicData uri="http://schemas.openxmlformats.org/drawingml/2006/picture">
-                <pic:pic xmlns:pic="http://schemas.openxmlformats.org/drawingml/2006/picture">
-                  <pic:nvPicPr>
-                    <pic:cNvPr id="2061290952" name="Picture 2061290952"/>
-                    <pic:cNvPicPr/>
-                  </pic:nvPicPr>
-                  <pic:blipFill>
-                    <a:blip r:embed="rId22" cstate="print">
-                      <a:extLst>
-                        <a:ext uri="{28A0092B-C50C-407E-A947-70E740481C1C}">
-                          <a14:useLocalDpi xmlns:a14="http://schemas.microsoft.com/office/drawing/2010/main" val="0"/>
-                        </a:ext>
-                      </a:extLst>
-                    </a:blip>
-                    <a:stretch>
-                      <a:fillRect/>
-                    </a:stretch>
-                  </pic:blipFill>
-                  <pic:spPr>
-                    <a:xfrm>
-                      <a:off x="0" y="0"/>
-                      <a:ext cx="5943600" cy="2792095"/>
-                    </a:xfrm>
-                    <a:prstGeom prst="rect">
-                      <a:avLst/>
-                    </a:prstGeom>
-                  </pic:spPr>
-                </pic:pic>
-              </a:graphicData>
-            </a:graphic>
-          </wp:anchor>
-        </w:drawing>
-      </w:r>
-      <w:r>
-        <w:tab/>
-      </w:r>
-      <w:r>
-        <w:tab/>
-      </w:r>
-      <w:r>
-        <w:tab/>
-      </w:r>
-      <w:r>
-        <w:tab/>
-      </w:r>
-      <w:r>
-        <w:tab/>
-      </w:r>
-      <w:r>
-        <w:tab/>
-      </w:r>
-      <w:r>
-        <w:tab/>
-      </w:r>
-      <w:r>
-        <w:tab/>
-      </w:r>
-      <w:r>
-        <w:tab/>
-      </w:r>
-      <w:r>
-        <w:tab/>
-      </w:r>
-      <w:r>
-        <w:tab/>
-      </w:r>
-      <w:r>
-        <w:tab/>
-      </w:r>
-      <w:r>
-        <w:tab/>
-      </w:r>
-      <w:r>
-        <w:tab/>
-      </w:r>
-      <w:r>
-        <w:tab/>
-      </w:r>
-      <w:r>
-        <w:tab/>
-      </w:r>
-      <w:r>
-        <w:tab/>
-      </w:r>
-      <w:r>
-        <w:tab/>
-      </w:r>
-      <w:r>
-        <w:tab/>
-      </w:r>
-      <w:r>
-        <w:tab/>
-      </w:r>
-      <w:r>
-        <w:tab/>
-      </w:r>
-      <w:r>
-        <w:tab/>
-      </w:r>
-      <w:r>
-        <w:tab/>
-      </w:r>
-      <w:r>
-        <w:tab/>
-      </w:r>
-      <w:r>
-        <w:tab/>
-      </w:r>
-      <w:r>
-        <w:tab/>
-      </w:r>
-      <w:r>
-        <w:tab/>
-      </w:r>
-      <w:r>
-        <w:tab/>
-      </w:r>
-      <w:r>
-        <w:tab/>
-      </w:r>
-      <w:r>
-        <w:tab/>
-      </w:r>
-      <w:r>
-        <w:tab/>
-      </w:r>
-      <w:r>
-        <w:tab/>
-      </w:r>
-      <w:r>
-        <w:tab/>
-      </w:r>
-      <w:r>
-        <w:tab/>
-      </w:r>
-      <w:r>
-        <w:tab/>
-      </w:r>
-      <w:r>
-        <w:tab/>
-      </w:r>
-      <w:r>
-        <w:tab/>
-      </w:r>
-      <w:r>
-        <w:tab/>
-      </w:r>
-      <w:r>
-        <w:tab/>
-      </w:r>
-      <w:r>
-        <w:tab/>
-      </w:r>
-      <w:r>
-        <w:tab/>
-      </w:r>
-      <w:r>
-        <w:tab/>
-      </w:r>
-      <w:r>
-        <w:tab/>
-      </w:r>
-      <w:r>
-        <w:tab/>
-      </w:r>
-      <w:r>
-        <w:tab/>
-      </w:r>
-      <w:r>
-        <w:tab/>
-      </w:r>
-      <w:r>
-        <w:tab/>
-      </w:r>
-      <w:r>
-        <w:tab/>
-      </w:r>
-      <w:r>
-        <w:tab/>
-      </w:r>
-      <w:r>
-        <w:tab/>
-      </w:r>
-      <w:r>
-        <w:tab/>
-      </w:r>
-      <w:r>
-        <w:tab/>
-      </w:r>
-      <w:r>
-        <w:tab/>
-      </w:r>
-      <w:r>
-        <w:tab/>
-      </w:r>
-      <w:r>
-        <w:tab/>
-      </w:r>
-      <w:r>
-        <w:tab/>
-      </w:r>
-      <w:r>
-        <w:tab/>
-      </w:r>
-      <w:r>
-        <w:tab/>
-      </w:r>
-      <w:r>
-        <w:tab/>
-      </w:r>
-      <w:r>
-        <w:tab/>
-      </w:r>
-      <w:r>
-        <w:tab/>
-      </w:r>
-      <w:r>
-        <w:tab/>
-      </w:r>
-      <w:r>
-        <w:tab/>
-      </w:r>
-      <w:r>
-        <w:tab/>
-      </w:r>
-      <w:r>
-        <w:tab/>
-      </w:r>
-      <w:r>
-        <w:tab/>
-      </w:r>
-      <w:r>
-        <w:tab/>
-      </w:r>
-      <w:r>
-        <w:tab/>
-      </w:r>
-      <w:r>
-        <w:tab/>
-      </w:r>
-      <w:r>
-        <w:tab/>
-      </w:r>
-      <w:r>
-        <w:tab/>
-      </w:r>
-      <w:r>
-        <w:tab/>
-      </w:r>
-      <w:r>
-        <w:tab/>
-      </w:r>
-      <w:r>
-        <w:tab/>
-      </w:r>
-      <w:r>
-        <w:tab/>
-      </w:r>
-      <w:r>
-        <w:tab/>
-      </w:r>
-      <w:r>
-        <w:tab/>
-      </w:r>
-      <w:r>
-        <w:tab/>
-      </w:r>
-      <w:r>
-        <w:tab/>
-      </w:r>
-      <w:r>
-        <w:tab/>
-      </w:r>
-      <w:r>
-        <w:tab/>
-      </w:r>
-      <w:r>
-        <w:tab/>
-      </w:r>
-      <w:r>
-        <w:tab/>
-      </w:r>
-      <w:r>
-        <w:tab/>
-      </w:r>
-      <w:r>
-        <w:tab/>
-      </w:r>
-      <w:r>
-        <w:tab/>
-      </w:r>
-      <w:r>
-        <w:tab/>
-      </w:r>
-      <w:r>
-        <w:tab/>
-      </w:r>
-      <w:r>
-        <w:tab/>
-      </w:r>
-      <w:r>
-        <w:tab/>
-      </w:r>
-      <w:r>
-        <w:tab/>
-      </w:r>
-      <w:r>
-        <w:tab/>
-      </w:r>
-      <w:r>
-        <w:tab/>
-      </w:r>
-      <w:r>
-        <w:tab/>
-      </w:r>
-      <w:r>
-        <w:tab/>
-      </w:r>
-      <w:r>
-        <w:tab/>
-      </w:r>
-      <w:r>
-        <w:tab/>
-      </w:r>
-      <w:r>
-        <w:tab/>
-      </w:r>
-      <w:r>
-        <w:tab/>
-      </w:r>
-      <w:r>
-        <w:tab/>
-      </w:r>
-      <w:r>
-        <w:tab/>
-      </w:r>
-      <w:r>
-        <w:tab/>
-      </w:r>
-      <w:r>
-        <w:tab/>
-      </w:r>
-      <w:r>
-        <w:tab/>
-      </w:r>
-      <w:r>
-        <w:tab/>
-      </w:r>
-      <w:r>
-        <w:tab/>
-      </w:r>
-      <w:r>
-        <w:tab/>
-      </w:r>
-      <w:r>
-        <w:tab/>
-      </w:r>
-      <w:r>
-        <w:tab/>
-      </w:r>
-      <w:r>
-        <w:tab/>
-      </w:r>
-      <w:r>
-        <w:tab/>
-      </w:r>
-      <w:r>
-        <w:tab/>
-      </w:r>
-      <w:r>
-        <w:tab/>
-      </w:r>
-      <w:r>
-        <w:tab/>
-      </w:r>
-      <w:r>
-        <w:tab/>
-      </w:r>
-      <w:r>
-        <w:tab/>
-      </w:r>
-      <w:r>
-        <w:tab/>
-      </w:r>
-      <w:r>
-        <w:tab/>
-      </w:r>
-      <w:r>
-        <w:tab/>
-      </w:r>
-      <w:r>
-        <w:tab/>
-      </w:r>
-      <w:r>
-        <w:tab/>
-      </w:r>
-      <w:r>
-        <w:tab/>
-      </w:r>
-      <w:r>
-        <w:tab/>
-      </w:r>
-      <w:r>
-        <w:tab/>
-      </w:r>
-      <w:r>
-        <w:tab/>
-      </w:r>
-      <w:r>
-        <w:tab/>
-      </w:r>
-      <w:r>
-        <w:tab/>
-      </w:r>
-      <w:r>
-        <w:tab/>
-      </w:r>
-      <w:r>
-        <w:tab/>
-      </w:r>
-      <w:r>
-        <w:tab/>
-      </w:r>
-      <w:r>
-        <w:tab/>
-      </w:r>
-      <w:r>
-        <w:tab/>
-      </w:r>
-      <w:r>
-        <w:tab/>
-      </w:r>
-      <w:r>
-        <w:tab/>
-      </w:r>
-      <w:r>
-        <w:tab/>
-      </w:r>
-      <w:r>
-        <w:tab/>
-      </w:r>
-      <w:r>
-        <w:tab/>
-      </w:r>
-      <w:r>
-        <w:tab/>
-      </w:r>
-      <w:r>
-        <w:tab/>
-      </w:r>
-      <w:r>
-        <w:tab/>
-      </w:r>
-      <w:r>
-        <w:tab/>
-      </w:r>
-      <w:r>
-        <w:tab/>
-      </w:r>
-      <w:r>
-        <w:tab/>
-      </w:r>
-      <w:r>
-        <w:tab/>
-      </w:r>
-      <w:r>
-        <w:tab/>
-      </w:r>
-      <w:r>
-        <w:tab/>
-      </w:r>
-      <w:r>
-        <w:tab/>
-      </w:r>
-      <w:r>
-        <w:tab/>
-      </w:r>
-      <w:r>
-        <w:tab/>
-      </w:r>
-      <w:r>
-        <w:tab/>
-      </w:r>
-      <w:r>
-        <w:tab/>
-      </w:r>
-      <w:r>
-        <w:tab/>
-      </w:r>
-      <w:r>
-        <w:tab/>
-      </w:r>
-      <w:r>
-        <w:tab/>
-      </w:r>
-      <w:r>
-        <w:tab/>
-      </w:r>
-      <w:r>
-        <w:tab/>
-      </w:r>
-      <w:r>
-        <w:tab/>
-      </w:r>
-      <w:r>
-        <w:tab/>
-      </w:r>
-      <w:r>
-        <w:tab/>
-      </w:r>
-      <w:r>
-        <w:tab/>
-      </w:r>
-      <w:r>
-        <w:tab/>
-      </w:r>
-      <w:r>
-        <w:tab/>
-      </w:r>
-      <w:r>
-        <w:tab/>
-      </w:r>
-      <w:r>
-        <w:tab/>
-      </w:r>
-      <w:r>
-        <w:tab/>
-      </w:r>
-      <w:r>
-        <w:tab/>
-      </w:r>
-      <w:r>
-        <w:tab/>
-      </w:r>
-      <w:r>
-        <w:tab/>
-      </w:r>
-      <w:r>
-        <w:tab/>
-      </w:r>
-      <w:r>
-        <w:tab/>
-      </w:r>
-      <w:r>
-        <w:tab/>
-      </w:r>
-      <w:r>
-        <w:tab/>
-      </w:r>
-      <w:r>
-        <w:tab/>
-      </w:r>
-      <w:r>
-        <w:tab/>
-      </w:r>
-      <w:r>
-        <w:tab/>
-      </w:r>
-      <w:r>
-        <w:tab/>
-      </w:r>
-      <w:r>
-        <w:tab/>
-      </w:r>
-      <w:r>
-        <w:tab/>
-      </w:r>
-      <w:r>
-        <w:tab/>
-      </w:r>
-      <w:r>
-        <w:tab/>
-      </w:r>
-      <w:r>
-        <w:tab/>
-      </w:r>
-      <w:r>
-        <w:tab/>
-      </w:r>
-    </w:p>
-    <w:p>
-      <w:r>
-        <w:tab/>
-      </w:r>
-    </w:p>
-    <w:p>
-      <w:r>
-        <w:tab/>
-      </w:r>
-      <w:r>
-        <w:tab/>
-      </w:r>
-      <w:r>
-        <w:tab/>
-      </w:r>
-      <w:r>
-        <w:tab/>
-      </w:r>
-      <w:r>
-        <w:tab/>
-      </w:r>
-      <w:r>
-        <w:tab/>
-      </w:r>
-      <w:r>
-        <w:tab/>
+        <w:t>Network Topology Diagram</w:t>
       </w:r>
       <w:r>
         <w:tab/>

</xml_diff>

<commit_message>
Create 5.2 and 5.3 diagrams
</commit_message>
<xml_diff>
--- a/Sheheryar_SDS Document Diagram.docx
+++ b/Sheheryar_SDS Document Diagram.docx
@@ -18879,17 +18879,2452 @@
       <w:r>
         <w:t>Network Topology Diagram</w:t>
       </w:r>
-      <w:r>
-        <w:tab/>
-      </w:r>
-      <w:r>
-        <w:tab/>
-      </w:r>
-      <w:r>
-        <w:tab/>
-      </w:r>
-      <w:r>
-        <w:tab/>
+    </w:p>
+    <w:p>
+      <w:r>
+        <w:rPr>
+          <w:noProof/>
+        </w:rPr>
+        <w:drawing>
+          <wp:anchor distT="0" distB="0" distL="114300" distR="114300" simplePos="0" relativeHeight="251679744" behindDoc="0" locked="0" layoutInCell="1" allowOverlap="1" wp14:anchorId="207353B8" wp14:editId="4034F9A2">
+            <wp:simplePos x="0" y="0"/>
+            <wp:positionH relativeFrom="margin">
+              <wp:align>right</wp:align>
+            </wp:positionH>
+            <wp:positionV relativeFrom="paragraph">
+              <wp:posOffset>312804</wp:posOffset>
+            </wp:positionV>
+            <wp:extent cx="5943600" cy="3147237"/>
+            <wp:effectExtent l="0" t="0" r="0" b="0"/>
+            <wp:wrapNone/>
+            <wp:docPr id="1868750677" name="Graphic 6"/>
+            <wp:cNvGraphicFramePr>
+              <a:graphicFrameLocks xmlns:a="http://schemas.openxmlformats.org/drawingml/2006/main" noChangeAspect="1"/>
+            </wp:cNvGraphicFramePr>
+            <a:graphic xmlns:a="http://schemas.openxmlformats.org/drawingml/2006/main">
+              <a:graphicData uri="http://schemas.openxmlformats.org/drawingml/2006/picture">
+                <pic:pic xmlns:pic="http://schemas.openxmlformats.org/drawingml/2006/picture">
+                  <pic:nvPicPr>
+                    <pic:cNvPr id="1868750677" name="Graphic 1868750677"/>
+                    <pic:cNvPicPr/>
+                  </pic:nvPicPr>
+                  <pic:blipFill>
+                    <a:blip r:embed="rId24">
+                      <a:extLst>
+                        <a:ext uri="{96DAC541-7B7A-43D3-8B79-37D633B846F1}">
+                          <asvg:svgBlip xmlns:asvg="http://schemas.microsoft.com/office/drawing/2016/SVG/main" r:embed="rId25"/>
+                        </a:ext>
+                      </a:extLst>
+                    </a:blip>
+                    <a:stretch>
+                      <a:fillRect/>
+                    </a:stretch>
+                  </pic:blipFill>
+                  <pic:spPr>
+                    <a:xfrm>
+                      <a:off x="0" y="0"/>
+                      <a:ext cx="5943600" cy="3147237"/>
+                    </a:xfrm>
+                    <a:prstGeom prst="rect">
+                      <a:avLst/>
+                    </a:prstGeom>
+                  </pic:spPr>
+                </pic:pic>
+              </a:graphicData>
+            </a:graphic>
+            <wp14:sizeRelV relativeFrom="margin">
+              <wp14:pctHeight>0</wp14:pctHeight>
+            </wp14:sizeRelV>
+          </wp:anchor>
+        </w:drawing>
+      </w:r>
+    </w:p>
+    <w:p>
+      <w:pPr>
+        <w:pStyle w:val="Heading1"/>
+      </w:pPr>
+      <w:r>
+        <w:tab/>
+      </w:r>
+      <w:r>
+        <w:tab/>
+      </w:r>
+      <w:r>
+        <w:tab/>
+      </w:r>
+      <w:r>
+        <w:tab/>
+      </w:r>
+      <w:r>
+        <w:tab/>
+      </w:r>
+      <w:r>
+        <w:tab/>
+      </w:r>
+      <w:r>
+        <w:tab/>
+      </w:r>
+      <w:r>
+        <w:tab/>
+      </w:r>
+      <w:r>
+        <w:tab/>
+      </w:r>
+      <w:r>
+        <w:tab/>
+      </w:r>
+      <w:r>
+        <w:tab/>
+      </w:r>
+      <w:r>
+        <w:tab/>
+      </w:r>
+      <w:r>
+        <w:tab/>
+      </w:r>
+      <w:r>
+        <w:tab/>
+      </w:r>
+      <w:r>
+        <w:tab/>
+      </w:r>
+      <w:r>
+        <w:tab/>
+      </w:r>
+      <w:r>
+        <w:tab/>
+      </w:r>
+      <w:r>
+        <w:tab/>
+      </w:r>
+      <w:r>
+        <w:tab/>
+      </w:r>
+      <w:r>
+        <w:tab/>
+      </w:r>
+      <w:r>
+        <w:tab/>
+      </w:r>
+      <w:r>
+        <w:tab/>
+      </w:r>
+      <w:r>
+        <w:tab/>
+      </w:r>
+      <w:r>
+        <w:tab/>
+      </w:r>
+      <w:r>
+        <w:tab/>
+      </w:r>
+      <w:r>
+        <w:tab/>
+      </w:r>
+      <w:r>
+        <w:tab/>
+      </w:r>
+      <w:r>
+        <w:tab/>
+      </w:r>
+      <w:r>
+        <w:tab/>
+      </w:r>
+      <w:r>
+        <w:tab/>
+      </w:r>
+      <w:r>
+        <w:tab/>
+      </w:r>
+      <w:r>
+        <w:tab/>
+      </w:r>
+      <w:r>
+        <w:tab/>
+      </w:r>
+      <w:r>
+        <w:tab/>
+      </w:r>
+      <w:r>
+        <w:tab/>
+      </w:r>
+      <w:r>
+        <w:tab/>
+      </w:r>
+      <w:r>
+        <w:tab/>
+      </w:r>
+      <w:r>
+        <w:tab/>
+      </w:r>
+      <w:r>
+        <w:tab/>
+      </w:r>
+      <w:r>
+        <w:tab/>
+      </w:r>
+      <w:r>
+        <w:tab/>
+      </w:r>
+      <w:r>
+        <w:tab/>
+      </w:r>
+      <w:r>
+        <w:tab/>
+      </w:r>
+      <w:r>
+        <w:tab/>
+      </w:r>
+      <w:r>
+        <w:tab/>
+      </w:r>
+      <w:r>
+        <w:tab/>
+      </w:r>
+      <w:r>
+        <w:tab/>
+      </w:r>
+      <w:r>
+        <w:tab/>
+      </w:r>
+      <w:r>
+        <w:tab/>
+      </w:r>
+      <w:r>
+        <w:tab/>
+      </w:r>
+      <w:r>
+        <w:tab/>
+      </w:r>
+      <w:r>
+        <w:tab/>
+      </w:r>
+      <w:r>
+        <w:tab/>
+      </w:r>
+      <w:r>
+        <w:tab/>
+      </w:r>
+      <w:r>
+        <w:tab/>
+      </w:r>
+      <w:r>
+        <w:tab/>
+      </w:r>
+      <w:r>
+        <w:tab/>
+      </w:r>
+      <w:r>
+        <w:tab/>
+      </w:r>
+      <w:r>
+        <w:tab/>
+      </w:r>
+      <w:r>
+        <w:tab/>
+      </w:r>
+      <w:r>
+        <w:tab/>
+      </w:r>
+      <w:r>
+        <w:tab/>
+      </w:r>
+      <w:r>
+        <w:tab/>
+      </w:r>
+      <w:r>
+        <w:tab/>
+      </w:r>
+      <w:r>
+        <w:tab/>
+      </w:r>
+      <w:r>
+        <w:tab/>
+      </w:r>
+      <w:r>
+        <w:tab/>
+      </w:r>
+      <w:r>
+        <w:tab/>
+      </w:r>
+      <w:r>
+        <w:tab/>
+      </w:r>
+      <w:r>
+        <w:tab/>
+      </w:r>
+      <w:r>
+        <w:tab/>
+      </w:r>
+      <w:r>
+        <w:tab/>
+      </w:r>
+      <w:r>
+        <w:tab/>
+      </w:r>
+      <w:r>
+        <w:tab/>
+      </w:r>
+      <w:r>
+        <w:tab/>
+      </w:r>
+      <w:r>
+        <w:tab/>
+      </w:r>
+      <w:r>
+        <w:tab/>
+      </w:r>
+      <w:r>
+        <w:tab/>
+      </w:r>
+      <w:r>
+        <w:tab/>
+      </w:r>
+      <w:r>
+        <w:tab/>
+      </w:r>
+      <w:r>
+        <w:tab/>
+      </w:r>
+      <w:r>
+        <w:tab/>
+      </w:r>
+      <w:r>
+        <w:tab/>
+      </w:r>
+      <w:r>
+        <w:tab/>
+      </w:r>
+      <w:r>
+        <w:tab/>
+      </w:r>
+      <w:r>
+        <w:tab/>
+      </w:r>
+      <w:r>
+        <w:tab/>
+      </w:r>
+      <w:r>
+        <w:tab/>
+      </w:r>
+      <w:r>
+        <w:tab/>
+      </w:r>
+      <w:r>
+        <w:tab/>
+      </w:r>
+      <w:r>
+        <w:tab/>
+      </w:r>
+      <w:r>
+        <w:tab/>
+      </w:r>
+      <w:r>
+        <w:tab/>
+      </w:r>
+      <w:r>
+        <w:tab/>
+      </w:r>
+      <w:r>
+        <w:tab/>
+      </w:r>
+      <w:r>
+        <w:tab/>
+      </w:r>
+      <w:r>
+        <w:tab/>
+      </w:r>
+      <w:r>
+        <w:tab/>
+      </w:r>
+      <w:r>
+        <w:tab/>
+      </w:r>
+      <w:r>
+        <w:tab/>
+      </w:r>
+      <w:r>
+        <w:tab/>
+      </w:r>
+      <w:r>
+        <w:tab/>
+      </w:r>
+      <w:r>
+        <w:tab/>
+      </w:r>
+      <w:r>
+        <w:tab/>
+      </w:r>
+      <w:r>
+        <w:tab/>
+      </w:r>
+      <w:r>
+        <w:tab/>
+      </w:r>
+      <w:r>
+        <w:tab/>
+      </w:r>
+      <w:r>
+        <w:tab/>
+      </w:r>
+      <w:r>
+        <w:tab/>
+      </w:r>
+      <w:r>
+        <w:tab/>
+      </w:r>
+      <w:r>
+        <w:tab/>
+      </w:r>
+      <w:r>
+        <w:tab/>
+      </w:r>
+      <w:r>
+        <w:tab/>
+      </w:r>
+      <w:r>
+        <w:tab/>
+      </w:r>
+      <w:r>
+        <w:tab/>
+      </w:r>
+      <w:r>
+        <w:tab/>
+      </w:r>
+      <w:r>
+        <w:tab/>
+      </w:r>
+      <w:r>
+        <w:tab/>
+      </w:r>
+      <w:r>
+        <w:tab/>
+      </w:r>
+      <w:r>
+        <w:tab/>
+      </w:r>
+      <w:r>
+        <w:tab/>
+      </w:r>
+      <w:r>
+        <w:tab/>
+      </w:r>
+      <w:r>
+        <w:tab/>
+      </w:r>
+      <w:r>
+        <w:tab/>
+      </w:r>
+      <w:r>
+        <w:tab/>
+      </w:r>
+      <w:r>
+        <w:tab/>
+      </w:r>
+      <w:r>
+        <w:tab/>
+      </w:r>
+      <w:r>
+        <w:tab/>
+      </w:r>
+      <w:r>
+        <w:tab/>
+      </w:r>
+    </w:p>
+    <w:p>
+      <w:pPr>
+        <w:pStyle w:val="Heading1"/>
+      </w:pPr>
+      <w:r>
+        <w:t>API Contract Diagram (Swagger/API Overview)</w:t>
+      </w:r>
+    </w:p>
+    <w:p>
+      <w:r>
+        <w:rPr>
+          <w:noProof/>
+        </w:rPr>
+        <w:drawing>
+          <wp:anchor distT="0" distB="0" distL="114300" distR="114300" simplePos="0" relativeHeight="251680768" behindDoc="0" locked="0" layoutInCell="1" allowOverlap="1" wp14:anchorId="79821EB4" wp14:editId="2A3BC8B7">
+            <wp:simplePos x="0" y="0"/>
+            <wp:positionH relativeFrom="margin">
+              <wp:align>right</wp:align>
+            </wp:positionH>
+            <wp:positionV relativeFrom="paragraph">
+              <wp:posOffset>317530</wp:posOffset>
+            </wp:positionV>
+            <wp:extent cx="5941806" cy="1446027"/>
+            <wp:effectExtent l="0" t="0" r="1905" b="1905"/>
+            <wp:wrapNone/>
+            <wp:docPr id="484218848" name="Graphic 7"/>
+            <wp:cNvGraphicFramePr>
+              <a:graphicFrameLocks xmlns:a="http://schemas.openxmlformats.org/drawingml/2006/main" noChangeAspect="1"/>
+            </wp:cNvGraphicFramePr>
+            <a:graphic xmlns:a="http://schemas.openxmlformats.org/drawingml/2006/main">
+              <a:graphicData uri="http://schemas.openxmlformats.org/drawingml/2006/picture">
+                <pic:pic xmlns:pic="http://schemas.openxmlformats.org/drawingml/2006/picture">
+                  <pic:nvPicPr>
+                    <pic:cNvPr id="484218848" name="Graphic 484218848"/>
+                    <pic:cNvPicPr/>
+                  </pic:nvPicPr>
+                  <pic:blipFill>
+                    <a:blip r:embed="rId26">
+                      <a:extLst>
+                        <a:ext uri="{96DAC541-7B7A-43D3-8B79-37D633B846F1}">
+                          <asvg:svgBlip xmlns:asvg="http://schemas.microsoft.com/office/drawing/2016/SVG/main" r:embed="rId27"/>
+                        </a:ext>
+                      </a:extLst>
+                    </a:blip>
+                    <a:stretch>
+                      <a:fillRect/>
+                    </a:stretch>
+                  </pic:blipFill>
+                  <pic:spPr>
+                    <a:xfrm>
+                      <a:off x="0" y="0"/>
+                      <a:ext cx="5944276" cy="1446628"/>
+                    </a:xfrm>
+                    <a:prstGeom prst="rect">
+                      <a:avLst/>
+                    </a:prstGeom>
+                  </pic:spPr>
+                </pic:pic>
+              </a:graphicData>
+            </a:graphic>
+            <wp14:sizeRelV relativeFrom="margin">
+              <wp14:pctHeight>0</wp14:pctHeight>
+            </wp14:sizeRelV>
+          </wp:anchor>
+        </w:drawing>
+      </w:r>
+    </w:p>
+    <w:p/>
+    <w:p>
+      <w:pPr>
+        <w:pStyle w:val="Heading1"/>
+      </w:pPr>
+      <w:r>
+        <w:tab/>
+      </w:r>
+      <w:r>
+        <w:tab/>
+      </w:r>
+      <w:r>
+        <w:tab/>
+      </w:r>
+      <w:r>
+        <w:tab/>
+      </w:r>
+      <w:r>
+        <w:tab/>
+      </w:r>
+      <w:r>
+        <w:tab/>
+      </w:r>
+      <w:r>
+        <w:tab/>
+      </w:r>
+      <w:r>
+        <w:tab/>
+      </w:r>
+      <w:r>
+        <w:tab/>
+      </w:r>
+      <w:r>
+        <w:tab/>
+      </w:r>
+      <w:r>
+        <w:tab/>
+      </w:r>
+      <w:r>
+        <w:tab/>
+      </w:r>
+      <w:r>
+        <w:tab/>
+      </w:r>
+      <w:r>
+        <w:tab/>
+      </w:r>
+      <w:r>
+        <w:tab/>
+      </w:r>
+      <w:r>
+        <w:tab/>
+      </w:r>
+      <w:r>
+        <w:tab/>
+      </w:r>
+      <w:r>
+        <w:tab/>
+      </w:r>
+      <w:r>
+        <w:tab/>
+      </w:r>
+      <w:r>
+        <w:tab/>
+      </w:r>
+      <w:r>
+        <w:tab/>
+      </w:r>
+      <w:r>
+        <w:tab/>
+      </w:r>
+      <w:r>
+        <w:tab/>
+      </w:r>
+      <w:r>
+        <w:tab/>
+      </w:r>
+      <w:r>
+        <w:tab/>
+      </w:r>
+      <w:r>
+        <w:tab/>
+      </w:r>
+      <w:r>
+        <w:tab/>
+      </w:r>
+      <w:r>
+        <w:tab/>
+      </w:r>
+      <w:r>
+        <w:tab/>
+      </w:r>
+      <w:r>
+        <w:tab/>
+      </w:r>
+      <w:r>
+        <w:tab/>
+      </w:r>
+      <w:r>
+        <w:tab/>
+      </w:r>
+      <w:r>
+        <w:tab/>
+      </w:r>
+      <w:r>
+        <w:tab/>
+      </w:r>
+      <w:r>
+        <w:tab/>
+      </w:r>
+      <w:r>
+        <w:tab/>
+      </w:r>
+      <w:r>
+        <w:tab/>
+      </w:r>
+      <w:r>
+        <w:tab/>
+      </w:r>
+      <w:r>
+        <w:tab/>
+      </w:r>
+      <w:r>
+        <w:tab/>
+      </w:r>
+      <w:r>
+        <w:tab/>
+      </w:r>
+      <w:r>
+        <w:tab/>
+      </w:r>
+      <w:r>
+        <w:tab/>
+      </w:r>
+      <w:r>
+        <w:tab/>
+      </w:r>
+      <w:r>
+        <w:tab/>
+      </w:r>
+      <w:r>
+        <w:tab/>
+      </w:r>
+      <w:r>
+        <w:tab/>
+      </w:r>
+      <w:r>
+        <w:tab/>
+      </w:r>
+      <w:r>
+        <w:tab/>
+      </w:r>
+      <w:r>
+        <w:tab/>
+      </w:r>
+      <w:r>
+        <w:tab/>
+      </w:r>
+      <w:r>
+        <w:tab/>
+      </w:r>
+      <w:r>
+        <w:tab/>
+      </w:r>
+    </w:p>
+    <w:p>
+      <w:pPr>
+        <w:rPr>
+          <w:rFonts w:asciiTheme="majorHAnsi" w:eastAsiaTheme="majorEastAsia" w:hAnsiTheme="majorHAnsi" w:cstheme="majorBidi"/>
+          <w:color w:val="2F5496" w:themeColor="accent1" w:themeShade="BF"/>
+          <w:sz w:val="40"/>
+          <w:szCs w:val="40"/>
+        </w:rPr>
+      </w:pPr>
+      <w:r>
+        <w:br w:type="page"/>
+      </w:r>
+    </w:p>
+    <w:p>
+      <w:pPr>
+        <w:pStyle w:val="Heading1"/>
+      </w:pPr>
+      <w:r>
+        <w:t>Data Flow Diagram for PCI DSS Scope</w:t>
+      </w:r>
+    </w:p>
+    <w:p>
+      <w:r>
+        <w:rPr>
+          <w:noProof/>
+        </w:rPr>
+        <w:drawing>
+          <wp:anchor distT="0" distB="0" distL="114300" distR="114300" simplePos="0" relativeHeight="251681792" behindDoc="0" locked="0" layoutInCell="1" allowOverlap="1" wp14:anchorId="604D187C" wp14:editId="3F1008B3">
+            <wp:simplePos x="0" y="0"/>
+            <wp:positionH relativeFrom="margin">
+              <wp:align>right</wp:align>
+            </wp:positionH>
+            <wp:positionV relativeFrom="paragraph">
+              <wp:posOffset>312803</wp:posOffset>
+            </wp:positionV>
+            <wp:extent cx="5943600" cy="1382233"/>
+            <wp:effectExtent l="0" t="0" r="0" b="8890"/>
+            <wp:wrapNone/>
+            <wp:docPr id="1382502621" name="Graphic 8"/>
+            <wp:cNvGraphicFramePr>
+              <a:graphicFrameLocks xmlns:a="http://schemas.openxmlformats.org/drawingml/2006/main" noChangeAspect="1"/>
+            </wp:cNvGraphicFramePr>
+            <a:graphic xmlns:a="http://schemas.openxmlformats.org/drawingml/2006/main">
+              <a:graphicData uri="http://schemas.openxmlformats.org/drawingml/2006/picture">
+                <pic:pic xmlns:pic="http://schemas.openxmlformats.org/drawingml/2006/picture">
+                  <pic:nvPicPr>
+                    <pic:cNvPr id="1382502621" name="Graphic 1382502621"/>
+                    <pic:cNvPicPr/>
+                  </pic:nvPicPr>
+                  <pic:blipFill>
+                    <a:blip r:embed="rId28">
+                      <a:extLst>
+                        <a:ext uri="{96DAC541-7B7A-43D3-8B79-37D633B846F1}">
+                          <asvg:svgBlip xmlns:asvg="http://schemas.microsoft.com/office/drawing/2016/SVG/main" r:embed="rId29"/>
+                        </a:ext>
+                      </a:extLst>
+                    </a:blip>
+                    <a:stretch>
+                      <a:fillRect/>
+                    </a:stretch>
+                  </pic:blipFill>
+                  <pic:spPr>
+                    <a:xfrm>
+                      <a:off x="0" y="0"/>
+                      <a:ext cx="5943600" cy="1382233"/>
+                    </a:xfrm>
+                    <a:prstGeom prst="rect">
+                      <a:avLst/>
+                    </a:prstGeom>
+                  </pic:spPr>
+                </pic:pic>
+              </a:graphicData>
+            </a:graphic>
+            <wp14:sizeRelV relativeFrom="margin">
+              <wp14:pctHeight>0</wp14:pctHeight>
+            </wp14:sizeRelV>
+          </wp:anchor>
+        </w:drawing>
+      </w:r>
+    </w:p>
+    <w:p>
+      <w:r>
+        <w:tab/>
+      </w:r>
+      <w:r>
+        <w:tab/>
+      </w:r>
+      <w:r>
+        <w:tab/>
+      </w:r>
+      <w:r>
+        <w:tab/>
+      </w:r>
+      <w:r>
+        <w:tab/>
+      </w:r>
+      <w:r>
+        <w:tab/>
+      </w:r>
+      <w:r>
+        <w:tab/>
+      </w:r>
+      <w:r>
+        <w:tab/>
+      </w:r>
+      <w:r>
+        <w:tab/>
+      </w:r>
+      <w:r>
+        <w:tab/>
+      </w:r>
+      <w:r>
+        <w:tab/>
+      </w:r>
+      <w:r>
+        <w:tab/>
+      </w:r>
+      <w:r>
+        <w:tab/>
+      </w:r>
+      <w:r>
+        <w:tab/>
+      </w:r>
+      <w:r>
+        <w:tab/>
+      </w:r>
+      <w:r>
+        <w:tab/>
+      </w:r>
+      <w:r>
+        <w:tab/>
+      </w:r>
+      <w:r>
+        <w:tab/>
+      </w:r>
+      <w:r>
+        <w:tab/>
+      </w:r>
+      <w:r>
+        <w:tab/>
+      </w:r>
+      <w:r>
+        <w:tab/>
+      </w:r>
+      <w:r>
+        <w:tab/>
+      </w:r>
+      <w:r>
+        <w:tab/>
+      </w:r>
+      <w:r>
+        <w:tab/>
+      </w:r>
+      <w:r>
+        <w:tab/>
+      </w:r>
+      <w:r>
+        <w:tab/>
+      </w:r>
+      <w:r>
+        <w:tab/>
+      </w:r>
+      <w:r>
+        <w:tab/>
+      </w:r>
+      <w:r>
+        <w:tab/>
+      </w:r>
+      <w:r>
+        <w:tab/>
+      </w:r>
+      <w:r>
+        <w:tab/>
+      </w:r>
+      <w:r>
+        <w:tab/>
+      </w:r>
+      <w:r>
+        <w:tab/>
+      </w:r>
+      <w:r>
+        <w:tab/>
+      </w:r>
+      <w:r>
+        <w:tab/>
+      </w:r>
+      <w:r>
+        <w:tab/>
+      </w:r>
+      <w:r>
+        <w:tab/>
+      </w:r>
+      <w:r>
+        <w:tab/>
+      </w:r>
+      <w:r>
+        <w:tab/>
+      </w:r>
+      <w:r>
+        <w:tab/>
+      </w:r>
+      <w:r>
+        <w:tab/>
+      </w:r>
+      <w:r>
+        <w:tab/>
+      </w:r>
+      <w:r>
+        <w:tab/>
+      </w:r>
+      <w:r>
+        <w:tab/>
+      </w:r>
+      <w:r>
+        <w:tab/>
+      </w:r>
+      <w:r>
+        <w:tab/>
+      </w:r>
+      <w:r>
+        <w:tab/>
+      </w:r>
+      <w:r>
+        <w:tab/>
+      </w:r>
+      <w:r>
+        <w:tab/>
+      </w:r>
+      <w:r>
+        <w:tab/>
+      </w:r>
+      <w:r>
+        <w:tab/>
+      </w:r>
+      <w:r>
+        <w:tab/>
+      </w:r>
+      <w:r>
+        <w:tab/>
+      </w:r>
+      <w:r>
+        <w:tab/>
+      </w:r>
+      <w:r>
+        <w:tab/>
+      </w:r>
+      <w:r>
+        <w:tab/>
+      </w:r>
+      <w:r>
+        <w:tab/>
+      </w:r>
+      <w:r>
+        <w:tab/>
+      </w:r>
+      <w:r>
+        <w:tab/>
+      </w:r>
+      <w:r>
+        <w:tab/>
+      </w:r>
+      <w:r>
+        <w:tab/>
+      </w:r>
+      <w:r>
+        <w:tab/>
+      </w:r>
+      <w:r>
+        <w:tab/>
+      </w:r>
+      <w:r>
+        <w:tab/>
+      </w:r>
+      <w:r>
+        <w:tab/>
+      </w:r>
+      <w:r>
+        <w:tab/>
+      </w:r>
+      <w:r>
+        <w:tab/>
+      </w:r>
+      <w:r>
+        <w:tab/>
+      </w:r>
+      <w:r>
+        <w:tab/>
+      </w:r>
+      <w:r>
+        <w:tab/>
+      </w:r>
+      <w:r>
+        <w:tab/>
+      </w:r>
+      <w:r>
+        <w:tab/>
+      </w:r>
+      <w:r>
+        <w:tab/>
+      </w:r>
+      <w:r>
+        <w:tab/>
+      </w:r>
+      <w:r>
+        <w:tab/>
+      </w:r>
+      <w:r>
+        <w:tab/>
+      </w:r>
+      <w:r>
+        <w:tab/>
+      </w:r>
+      <w:r>
+        <w:tab/>
+      </w:r>
+      <w:r>
+        <w:tab/>
+      </w:r>
+      <w:r>
+        <w:tab/>
+      </w:r>
+      <w:r>
+        <w:tab/>
+      </w:r>
+      <w:r>
+        <w:tab/>
+      </w:r>
+      <w:r>
+        <w:tab/>
+      </w:r>
+      <w:r>
+        <w:tab/>
+      </w:r>
+      <w:r>
+        <w:tab/>
+      </w:r>
+      <w:r>
+        <w:tab/>
+      </w:r>
+      <w:r>
+        <w:tab/>
+      </w:r>
+      <w:r>
+        <w:tab/>
+      </w:r>
+      <w:r>
+        <w:tab/>
+      </w:r>
+      <w:r>
+        <w:tab/>
+      </w:r>
+      <w:r>
+        <w:tab/>
+      </w:r>
+      <w:r>
+        <w:tab/>
+      </w:r>
+      <w:r>
+        <w:tab/>
+      </w:r>
+      <w:r>
+        <w:tab/>
+      </w:r>
+      <w:r>
+        <w:tab/>
+      </w:r>
+      <w:r>
+        <w:tab/>
+      </w:r>
+      <w:r>
+        <w:tab/>
+      </w:r>
+      <w:r>
+        <w:tab/>
+      </w:r>
+      <w:r>
+        <w:tab/>
+      </w:r>
+      <w:r>
+        <w:tab/>
+      </w:r>
+      <w:r>
+        <w:tab/>
+      </w:r>
+      <w:r>
+        <w:tab/>
+      </w:r>
+      <w:r>
+        <w:tab/>
+      </w:r>
+      <w:r>
+        <w:tab/>
+      </w:r>
+    </w:p>
+    <w:p/>
+    <w:p/>
+    <w:p>
+      <w:r>
+        <w:br w:type="page"/>
+      </w:r>
+    </w:p>
+    <w:p>
+      <w:pPr>
+        <w:pStyle w:val="Heading1"/>
+      </w:pPr>
+      <w:r>
+        <w:t>Audit Logging Flow Diagram</w:t>
+      </w:r>
+    </w:p>
+    <w:p/>
+    <w:p>
+      <w:r>
+        <w:rPr>
+          <w:noProof/>
+        </w:rPr>
+        <w:drawing>
+          <wp:anchor distT="0" distB="0" distL="114300" distR="114300" simplePos="0" relativeHeight="251682816" behindDoc="0" locked="0" layoutInCell="1" allowOverlap="1" wp14:anchorId="44C27C23" wp14:editId="3B4D2EEB">
+            <wp:simplePos x="0" y="0"/>
+            <wp:positionH relativeFrom="column">
+              <wp:posOffset>0</wp:posOffset>
+            </wp:positionH>
+            <wp:positionV relativeFrom="paragraph">
+              <wp:posOffset>-635</wp:posOffset>
+            </wp:positionV>
+            <wp:extent cx="5943600" cy="6767830"/>
+            <wp:effectExtent l="0" t="0" r="0" b="0"/>
+            <wp:wrapNone/>
+            <wp:docPr id="821938682" name="Graphic 9"/>
+            <wp:cNvGraphicFramePr>
+              <a:graphicFrameLocks xmlns:a="http://schemas.openxmlformats.org/drawingml/2006/main" noChangeAspect="1"/>
+            </wp:cNvGraphicFramePr>
+            <a:graphic xmlns:a="http://schemas.openxmlformats.org/drawingml/2006/main">
+              <a:graphicData uri="http://schemas.openxmlformats.org/drawingml/2006/picture">
+                <pic:pic xmlns:pic="http://schemas.openxmlformats.org/drawingml/2006/picture">
+                  <pic:nvPicPr>
+                    <pic:cNvPr id="821938682" name="Graphic 821938682"/>
+                    <pic:cNvPicPr/>
+                  </pic:nvPicPr>
+                  <pic:blipFill>
+                    <a:blip r:embed="rId30">
+                      <a:extLst>
+                        <a:ext uri="{96DAC541-7B7A-43D3-8B79-37D633B846F1}">
+                          <asvg:svgBlip xmlns:asvg="http://schemas.microsoft.com/office/drawing/2016/SVG/main" r:embed="rId31"/>
+                        </a:ext>
+                      </a:extLst>
+                    </a:blip>
+                    <a:stretch>
+                      <a:fillRect/>
+                    </a:stretch>
+                  </pic:blipFill>
+                  <pic:spPr>
+                    <a:xfrm>
+                      <a:off x="0" y="0"/>
+                      <a:ext cx="5943600" cy="6767830"/>
+                    </a:xfrm>
+                    <a:prstGeom prst="rect">
+                      <a:avLst/>
+                    </a:prstGeom>
+                  </pic:spPr>
+                </pic:pic>
+              </a:graphicData>
+            </a:graphic>
+          </wp:anchor>
+        </w:drawing>
+      </w:r>
+      <w:r>
+        <w:tab/>
+      </w:r>
+      <w:r>
+        <w:tab/>
+      </w:r>
+      <w:r>
+        <w:tab/>
+      </w:r>
+      <w:r>
+        <w:tab/>
+      </w:r>
+      <w:r>
+        <w:tab/>
+      </w:r>
+      <w:r>
+        <w:tab/>
+      </w:r>
+      <w:r>
+        <w:tab/>
+      </w:r>
+      <w:r>
+        <w:tab/>
+      </w:r>
+      <w:r>
+        <w:tab/>
+      </w:r>
+      <w:r>
+        <w:tab/>
+      </w:r>
+      <w:r>
+        <w:tab/>
+      </w:r>
+      <w:r>
+        <w:tab/>
+      </w:r>
+      <w:r>
+        <w:tab/>
+      </w:r>
+      <w:r>
+        <w:tab/>
+      </w:r>
+      <w:r>
+        <w:tab/>
+      </w:r>
+      <w:r>
+        <w:tab/>
+      </w:r>
+      <w:r>
+        <w:tab/>
+      </w:r>
+      <w:r>
+        <w:tab/>
+      </w:r>
+      <w:r>
+        <w:tab/>
+      </w:r>
+      <w:r>
+        <w:tab/>
+      </w:r>
+      <w:r>
+        <w:tab/>
+      </w:r>
+      <w:r>
+        <w:tab/>
+      </w:r>
+      <w:r>
+        <w:tab/>
+      </w:r>
+      <w:r>
+        <w:tab/>
+      </w:r>
+      <w:r>
+        <w:tab/>
+      </w:r>
+      <w:r>
+        <w:tab/>
+      </w:r>
+      <w:r>
+        <w:tab/>
+      </w:r>
+      <w:r>
+        <w:tab/>
+      </w:r>
+      <w:r>
+        <w:tab/>
+      </w:r>
+      <w:r>
+        <w:tab/>
+      </w:r>
+      <w:r>
+        <w:tab/>
+      </w:r>
+      <w:r>
+        <w:tab/>
+      </w:r>
+      <w:r>
+        <w:tab/>
+      </w:r>
+      <w:r>
+        <w:tab/>
+      </w:r>
+      <w:r>
+        <w:tab/>
+      </w:r>
+      <w:r>
+        <w:tab/>
+      </w:r>
+      <w:r>
+        <w:tab/>
+      </w:r>
+      <w:r>
+        <w:tab/>
+      </w:r>
+      <w:r>
+        <w:tab/>
+      </w:r>
+      <w:r>
+        <w:tab/>
+      </w:r>
+      <w:r>
+        <w:tab/>
+      </w:r>
+      <w:r>
+        <w:tab/>
+      </w:r>
+      <w:r>
+        <w:tab/>
+      </w:r>
+      <w:r>
+        <w:tab/>
+      </w:r>
+      <w:r>
+        <w:tab/>
+      </w:r>
+      <w:r>
+        <w:tab/>
+      </w:r>
+      <w:r>
+        <w:tab/>
+      </w:r>
+      <w:r>
+        <w:tab/>
+      </w:r>
+      <w:r>
+        <w:tab/>
+      </w:r>
+      <w:r>
+        <w:tab/>
+      </w:r>
+      <w:r>
+        <w:tab/>
+      </w:r>
+      <w:r>
+        <w:tab/>
+      </w:r>
+      <w:r>
+        <w:tab/>
+      </w:r>
+      <w:r>
+        <w:tab/>
+      </w:r>
+      <w:r>
+        <w:tab/>
+      </w:r>
+      <w:r>
+        <w:tab/>
+      </w:r>
+      <w:r>
+        <w:tab/>
+      </w:r>
+      <w:r>
+        <w:tab/>
+      </w:r>
+      <w:r>
+        <w:tab/>
+      </w:r>
+      <w:r>
+        <w:tab/>
+      </w:r>
+      <w:r>
+        <w:tab/>
+      </w:r>
+      <w:r>
+        <w:tab/>
+      </w:r>
+      <w:r>
+        <w:tab/>
+      </w:r>
+      <w:r>
+        <w:tab/>
+      </w:r>
+      <w:r>
+        <w:tab/>
+      </w:r>
+      <w:r>
+        <w:tab/>
+      </w:r>
+      <w:r>
+        <w:tab/>
+      </w:r>
+      <w:r>
+        <w:tab/>
+      </w:r>
+      <w:r>
+        <w:tab/>
+      </w:r>
+      <w:r>
+        <w:tab/>
+      </w:r>
+      <w:r>
+        <w:tab/>
+      </w:r>
+      <w:r>
+        <w:tab/>
+      </w:r>
+      <w:r>
+        <w:tab/>
+      </w:r>
+      <w:r>
+        <w:tab/>
+      </w:r>
+      <w:r>
+        <w:tab/>
+      </w:r>
+      <w:r>
+        <w:tab/>
+      </w:r>
+      <w:r>
+        <w:tab/>
+      </w:r>
+      <w:r>
+        <w:tab/>
+      </w:r>
+      <w:r>
+        <w:tab/>
+      </w:r>
+      <w:r>
+        <w:tab/>
+      </w:r>
+      <w:r>
+        <w:tab/>
+      </w:r>
+      <w:r>
+        <w:tab/>
+      </w:r>
+      <w:r>
+        <w:tab/>
+      </w:r>
+      <w:r>
+        <w:tab/>
+      </w:r>
+      <w:r>
+        <w:tab/>
+      </w:r>
+      <w:r>
+        <w:tab/>
+      </w:r>
+      <w:r>
+        <w:tab/>
+      </w:r>
+      <w:r>
+        <w:tab/>
+      </w:r>
+      <w:r>
+        <w:tab/>
+      </w:r>
+      <w:r>
+        <w:tab/>
+      </w:r>
+      <w:r>
+        <w:tab/>
+      </w:r>
+      <w:r>
+        <w:tab/>
+      </w:r>
+      <w:r>
+        <w:tab/>
+      </w:r>
+      <w:r>
+        <w:tab/>
+      </w:r>
+      <w:r>
+        <w:tab/>
+      </w:r>
+      <w:r>
+        <w:tab/>
+      </w:r>
+      <w:r>
+        <w:tab/>
+      </w:r>
+      <w:r>
+        <w:tab/>
+      </w:r>
+      <w:r>
+        <w:tab/>
+      </w:r>
+      <w:r>
+        <w:tab/>
+      </w:r>
+      <w:r>
+        <w:tab/>
+      </w:r>
+      <w:r>
+        <w:tab/>
+      </w:r>
+      <w:r>
+        <w:tab/>
+      </w:r>
+      <w:r>
+        <w:tab/>
+      </w:r>
+      <w:r>
+        <w:tab/>
+      </w:r>
+      <w:r>
+        <w:tab/>
+      </w:r>
+      <w:r>
+        <w:tab/>
+      </w:r>
+      <w:r>
+        <w:tab/>
+      </w:r>
+      <w:r>
+        <w:tab/>
+      </w:r>
+      <w:r>
+        <w:tab/>
+      </w:r>
+      <w:r>
+        <w:tab/>
+      </w:r>
+      <w:r>
+        <w:tab/>
+      </w:r>
+      <w:r>
+        <w:tab/>
+      </w:r>
+      <w:r>
+        <w:tab/>
+      </w:r>
+      <w:r>
+        <w:tab/>
+      </w:r>
+      <w:r>
+        <w:tab/>
+      </w:r>
+      <w:r>
+        <w:tab/>
+      </w:r>
+      <w:r>
+        <w:tab/>
+      </w:r>
+      <w:r>
+        <w:tab/>
+      </w:r>
+      <w:r>
+        <w:tab/>
+      </w:r>
+      <w:r>
+        <w:tab/>
+      </w:r>
+      <w:r>
+        <w:tab/>
+      </w:r>
+      <w:r>
+        <w:tab/>
+      </w:r>
+      <w:r>
+        <w:tab/>
+      </w:r>
+      <w:r>
+        <w:tab/>
+      </w:r>
+      <w:r>
+        <w:tab/>
+      </w:r>
+      <w:r>
+        <w:tab/>
+      </w:r>
+      <w:r>
+        <w:tab/>
+      </w:r>
+      <w:r>
+        <w:tab/>
+      </w:r>
+      <w:r>
+        <w:tab/>
+      </w:r>
+      <w:r>
+        <w:tab/>
+      </w:r>
+      <w:r>
+        <w:tab/>
+      </w:r>
+      <w:r>
+        <w:tab/>
+      </w:r>
+      <w:r>
+        <w:tab/>
+      </w:r>
+      <w:r>
+        <w:tab/>
+      </w:r>
+      <w:r>
+        <w:tab/>
+      </w:r>
+      <w:r>
+        <w:tab/>
+      </w:r>
+      <w:r>
+        <w:tab/>
+      </w:r>
+      <w:r>
+        <w:tab/>
+      </w:r>
+      <w:r>
+        <w:tab/>
+      </w:r>
+      <w:r>
+        <w:tab/>
+      </w:r>
+      <w:r>
+        <w:tab/>
+      </w:r>
+      <w:r>
+        <w:tab/>
+      </w:r>
+      <w:r>
+        <w:tab/>
+      </w:r>
+      <w:r>
+        <w:tab/>
+      </w:r>
+      <w:r>
+        <w:tab/>
+      </w:r>
+      <w:r>
+        <w:tab/>
+      </w:r>
+      <w:r>
+        <w:tab/>
+      </w:r>
+      <w:r>
+        <w:tab/>
+      </w:r>
+      <w:r>
+        <w:tab/>
+      </w:r>
+      <w:r>
+        <w:tab/>
+      </w:r>
+      <w:r>
+        <w:tab/>
+      </w:r>
+      <w:r>
+        <w:tab/>
+      </w:r>
+      <w:r>
+        <w:tab/>
+      </w:r>
+      <w:r>
+        <w:tab/>
+      </w:r>
+      <w:r>
+        <w:tab/>
+      </w:r>
+      <w:r>
+        <w:tab/>
+      </w:r>
+      <w:r>
+        <w:tab/>
+      </w:r>
+      <w:r>
+        <w:tab/>
+      </w:r>
+      <w:r>
+        <w:tab/>
+      </w:r>
+      <w:r>
+        <w:tab/>
+      </w:r>
+      <w:r>
+        <w:tab/>
+      </w:r>
+      <w:r>
+        <w:tab/>
+      </w:r>
+      <w:r>
+        <w:tab/>
+      </w:r>
+      <w:r>
+        <w:tab/>
+      </w:r>
+      <w:r>
+        <w:tab/>
+      </w:r>
+      <w:r>
+        <w:tab/>
+      </w:r>
+      <w:r>
+        <w:tab/>
+      </w:r>
+      <w:r>
+        <w:tab/>
+      </w:r>
+      <w:r>
+        <w:tab/>
+      </w:r>
+      <w:r>
+        <w:tab/>
+      </w:r>
+      <w:r>
+        <w:tab/>
+      </w:r>
+      <w:r>
+        <w:tab/>
+      </w:r>
+      <w:r>
+        <w:tab/>
+      </w:r>
+      <w:r>
+        <w:tab/>
+      </w:r>
+      <w:r>
+        <w:tab/>
+      </w:r>
+      <w:r>
+        <w:tab/>
+      </w:r>
+      <w:r>
+        <w:tab/>
+      </w:r>
+      <w:r>
+        <w:tab/>
+      </w:r>
+      <w:r>
+        <w:tab/>
+      </w:r>
+      <w:r>
+        <w:tab/>
+      </w:r>
+      <w:r>
+        <w:tab/>
+      </w:r>
+      <w:r>
+        <w:tab/>
+      </w:r>
+      <w:r>
+        <w:tab/>
+      </w:r>
+      <w:r>
+        <w:tab/>
+      </w:r>
+      <w:r>
+        <w:tab/>
+      </w:r>
+      <w:r>
+        <w:tab/>
+      </w:r>
+      <w:r>
+        <w:tab/>
+      </w:r>
+      <w:r>
+        <w:tab/>
+      </w:r>
+      <w:r>
+        <w:tab/>
+      </w:r>
+      <w:r>
+        <w:tab/>
+      </w:r>
+      <w:r>
+        <w:tab/>
+      </w:r>
+      <w:r>
+        <w:tab/>
+      </w:r>
+      <w:r>
+        <w:tab/>
+      </w:r>
+      <w:r>
+        <w:tab/>
+      </w:r>
+      <w:r>
+        <w:tab/>
+      </w:r>
+      <w:r>
+        <w:tab/>
+      </w:r>
+      <w:r>
+        <w:tab/>
+      </w:r>
+      <w:r>
+        <w:tab/>
+      </w:r>
+      <w:r>
+        <w:tab/>
+      </w:r>
+      <w:r>
+        <w:tab/>
+      </w:r>
+      <w:r>
+        <w:tab/>
+      </w:r>
+      <w:r>
+        <w:tab/>
+      </w:r>
+      <w:r>
+        <w:tab/>
+      </w:r>
+      <w:r>
+        <w:tab/>
+      </w:r>
+      <w:r>
+        <w:tab/>
+      </w:r>
+      <w:r>
+        <w:tab/>
+      </w:r>
+      <w:r>
+        <w:tab/>
+      </w:r>
+      <w:r>
+        <w:tab/>
+      </w:r>
+      <w:r>
+        <w:tab/>
+      </w:r>
+      <w:r>
+        <w:tab/>
+      </w:r>
+      <w:r>
+        <w:tab/>
+      </w:r>
+      <w:r>
+        <w:tab/>
+      </w:r>
+      <w:r>
+        <w:tab/>
+      </w:r>
+      <w:r>
+        <w:tab/>
+      </w:r>
+      <w:r>
+        <w:tab/>
+      </w:r>
+      <w:r>
+        <w:tab/>
+      </w:r>
+      <w:r>
+        <w:tab/>
+      </w:r>
+      <w:r>
+        <w:tab/>
+      </w:r>
+      <w:r>
+        <w:tab/>
+      </w:r>
+      <w:r>
+        <w:tab/>
+      </w:r>
+      <w:r>
+        <w:tab/>
+      </w:r>
+      <w:r>
+        <w:tab/>
+      </w:r>
+      <w:r>
+        <w:tab/>
+      </w:r>
+      <w:r>
+        <w:tab/>
+      </w:r>
+      <w:r>
+        <w:tab/>
+      </w:r>
+      <w:r>
+        <w:tab/>
+      </w:r>
+      <w:r>
+        <w:tab/>
+      </w:r>
+      <w:r>
+        <w:tab/>
+      </w:r>
+      <w:r>
+        <w:tab/>
+      </w:r>
+      <w:r>
+        <w:tab/>
+      </w:r>
+      <w:r>
+        <w:tab/>
+      </w:r>
+      <w:r>
+        <w:tab/>
+      </w:r>
+      <w:r>
+        <w:tab/>
+      </w:r>
+      <w:r>
+        <w:tab/>
+      </w:r>
+      <w:r>
+        <w:tab/>
+      </w:r>
+      <w:r>
+        <w:tab/>
+      </w:r>
+      <w:r>
+        <w:tab/>
+      </w:r>
+      <w:r>
+        <w:tab/>
+      </w:r>
+      <w:r>
+        <w:tab/>
+      </w:r>
+      <w:r>
+        <w:tab/>
+      </w:r>
+      <w:r>
+        <w:tab/>
+      </w:r>
+      <w:r>
+        <w:tab/>
+      </w:r>
+      <w:r>
+        <w:tab/>
+      </w:r>
+      <w:r>
+        <w:tab/>
+      </w:r>
+      <w:r>
+        <w:tab/>
+      </w:r>
+      <w:r>
+        <w:tab/>
+      </w:r>
+      <w:r>
+        <w:tab/>
+      </w:r>
+      <w:r>
+        <w:tab/>
+      </w:r>
+      <w:r>
+        <w:tab/>
+      </w:r>
+      <w:r>
+        <w:tab/>
+      </w:r>
+      <w:r>
+        <w:tab/>
+      </w:r>
+      <w:r>
+        <w:tab/>
+      </w:r>
+      <w:r>
+        <w:tab/>
+      </w:r>
+      <w:r>
+        <w:tab/>
+      </w:r>
+      <w:r>
+        <w:tab/>
+      </w:r>
+      <w:r>
+        <w:tab/>
+      </w:r>
+      <w:r>
+        <w:tab/>
+      </w:r>
+      <w:r>
+        <w:tab/>
+      </w:r>
+      <w:r>
+        <w:tab/>
+      </w:r>
+      <w:r>
+        <w:tab/>
+      </w:r>
+      <w:r>
+        <w:tab/>
+      </w:r>
+      <w:r>
+        <w:tab/>
+      </w:r>
+      <w:r>
+        <w:tab/>
+      </w:r>
+      <w:r>
+        <w:tab/>
+      </w:r>
+      <w:r>
+        <w:tab/>
+      </w:r>
+      <w:r>
+        <w:tab/>
+      </w:r>
+      <w:r>
+        <w:tab/>
+      </w:r>
+      <w:r>
+        <w:tab/>
+      </w:r>
+      <w:r>
+        <w:tab/>
+      </w:r>
+      <w:r>
+        <w:tab/>
+      </w:r>
+      <w:r>
+        <w:tab/>
+      </w:r>
+      <w:r>
+        <w:tab/>
+      </w:r>
+      <w:r>
+        <w:tab/>
+      </w:r>
+      <w:r>
+        <w:tab/>
+      </w:r>
+      <w:r>
+        <w:tab/>
+      </w:r>
+      <w:r>
+        <w:tab/>
+      </w:r>
+      <w:r>
+        <w:tab/>
+      </w:r>
+      <w:r>
+        <w:tab/>
+      </w:r>
+      <w:r>
+        <w:tab/>
+      </w:r>
+      <w:r>
+        <w:tab/>
+      </w:r>
+      <w:r>
+        <w:tab/>
+      </w:r>
+      <w:r>
+        <w:tab/>
+      </w:r>
+      <w:r>
+        <w:tab/>
+      </w:r>
+      <w:r>
+        <w:tab/>
+      </w:r>
+      <w:r>
+        <w:tab/>
+      </w:r>
+      <w:r>
+        <w:tab/>
+      </w:r>
+      <w:r>
+        <w:tab/>
+      </w:r>
+      <w:r>
+        <w:tab/>
+      </w:r>
+      <w:r>
+        <w:tab/>
+      </w:r>
+      <w:r>
+        <w:tab/>
+      </w:r>
+      <w:r>
+        <w:tab/>
+      </w:r>
+      <w:r>
+        <w:tab/>
+      </w:r>
+      <w:r>
+        <w:tab/>
+      </w:r>
+      <w:r>
+        <w:tab/>
+      </w:r>
+      <w:r>
+        <w:tab/>
+      </w:r>
+      <w:r>
+        <w:tab/>
+      </w:r>
+      <w:r>
+        <w:tab/>
+      </w:r>
+      <w:r>
+        <w:tab/>
+      </w:r>
+      <w:r>
+        <w:tab/>
+      </w:r>
+      <w:r>
+        <w:tab/>
+      </w:r>
+      <w:r>
+        <w:tab/>
+      </w:r>
+      <w:r>
+        <w:tab/>
+      </w:r>
+      <w:r>
+        <w:tab/>
+      </w:r>
+      <w:r>
+        <w:tab/>
+      </w:r>
+      <w:r>
+        <w:tab/>
+      </w:r>
+      <w:r>
+        <w:tab/>
+      </w:r>
+      <w:r>
+        <w:tab/>
+      </w:r>
+      <w:r>
+        <w:tab/>
+      </w:r>
+      <w:r>
+        <w:tab/>
+      </w:r>
+      <w:r>
+        <w:tab/>
+      </w:r>
+      <w:r>
+        <w:tab/>
+      </w:r>
+      <w:r>
+        <w:tab/>
+      </w:r>
+      <w:r>
+        <w:tab/>
+      </w:r>
+      <w:r>
+        <w:tab/>
+      </w:r>
+      <w:r>
+        <w:tab/>
+      </w:r>
+      <w:r>
+        <w:tab/>
+      </w:r>
+      <w:r>
+        <w:tab/>
+      </w:r>
+      <w:r>
+        <w:tab/>
+      </w:r>
+      <w:r>
+        <w:tab/>
+      </w:r>
+      <w:r>
+        <w:tab/>
+      </w:r>
+      <w:r>
+        <w:tab/>
+      </w:r>
+      <w:r>
+        <w:tab/>
+      </w:r>
+      <w:r>
+        <w:tab/>
+      </w:r>
+      <w:r>
+        <w:tab/>
+      </w:r>
+      <w:r>
+        <w:tab/>
+      </w:r>
+      <w:r>
+        <w:tab/>
+      </w:r>
+      <w:r>
+        <w:tab/>
+      </w:r>
+      <w:r>
+        <w:tab/>
+      </w:r>
+      <w:r>
+        <w:tab/>
+      </w:r>
+      <w:r>
+        <w:tab/>
+      </w:r>
+      <w:r>
+        <w:tab/>
+      </w:r>
+      <w:r>
+        <w:tab/>
+      </w:r>
+      <w:r>
+        <w:tab/>
+      </w:r>
+      <w:r>
+        <w:tab/>
+      </w:r>
+      <w:r>
+        <w:tab/>
+      </w:r>
+      <w:r>
+        <w:tab/>
+      </w:r>
+      <w:r>
+        <w:tab/>
+      </w:r>
+      <w:r>
+        <w:tab/>
+      </w:r>
+      <w:r>
+        <w:tab/>
+      </w:r>
+      <w:r>
+        <w:tab/>
+      </w:r>
+      <w:r>
+        <w:tab/>
+      </w:r>
+      <w:r>
+        <w:tab/>
+      </w:r>
+      <w:r>
+        <w:tab/>
+      </w:r>
+      <w:r>
+        <w:tab/>
+      </w:r>
+      <w:r>
+        <w:tab/>
+      </w:r>
+      <w:r>
+        <w:tab/>
+      </w:r>
+      <w:r>
+        <w:tab/>
+      </w:r>
+      <w:r>
+        <w:tab/>
+      </w:r>
+      <w:r>
+        <w:tab/>
+      </w:r>
+      <w:r>
+        <w:tab/>
+      </w:r>
+      <w:r>
+        <w:tab/>
+      </w:r>
+      <w:r>
+        <w:tab/>
+      </w:r>
+      <w:r>
+        <w:tab/>
+      </w:r>
+      <w:r>
+        <w:tab/>
+      </w:r>
+      <w:r>
+        <w:tab/>
+      </w:r>
+      <w:r>
+        <w:tab/>
+      </w:r>
+      <w:r>
+        <w:tab/>
+      </w:r>
+      <w:r>
+        <w:tab/>
+      </w:r>
+      <w:r>
+        <w:tab/>
+      </w:r>
+      <w:r>
+        <w:tab/>
+      </w:r>
+      <w:r>
+        <w:tab/>
+      </w:r>
+      <w:r>
+        <w:tab/>
+      </w:r>
+      <w:r>
+        <w:tab/>
+      </w:r>
+      <w:r>
+        <w:tab/>
+      </w:r>
+      <w:r>
+        <w:tab/>
+      </w:r>
+      <w:r>
+        <w:tab/>
+      </w:r>
+      <w:r>
+        <w:tab/>
+      </w:r>
+      <w:r>
+        <w:tab/>
+      </w:r>
+      <w:r>
+        <w:tab/>
+      </w:r>
+      <w:r>
+        <w:tab/>
+      </w:r>
+      <w:r>
+        <w:tab/>
+      </w:r>
+      <w:r>
+        <w:tab/>
+      </w:r>
+      <w:r>
+        <w:tab/>
+      </w:r>
+      <w:r>
+        <w:tab/>
+      </w:r>
+      <w:r>
+        <w:tab/>
+      </w:r>
+      <w:r>
+        <w:tab/>
+      </w:r>
+      <w:r>
+        <w:tab/>
+      </w:r>
+      <w:r>
+        <w:tab/>
+      </w:r>
+      <w:r>
+        <w:tab/>
+      </w:r>
+      <w:r>
+        <w:tab/>
+      </w:r>
+      <w:r>
+        <w:tab/>
+      </w:r>
+      <w:r>
+        <w:tab/>
+      </w:r>
+      <w:r>
+        <w:tab/>
+      </w:r>
+      <w:r>
+        <w:tab/>
+      </w:r>
+      <w:r>
+        <w:tab/>
+      </w:r>
+      <w:r>
+        <w:tab/>
+      </w:r>
+      <w:r>
+        <w:tab/>
+      </w:r>
+      <w:r>
+        <w:tab/>
+      </w:r>
+      <w:r>
+        <w:tab/>
+      </w:r>
+      <w:r>
+        <w:tab/>
+      </w:r>
+      <w:r>
+        <w:tab/>
+      </w:r>
+      <w:r>
+        <w:tab/>
+      </w:r>
+      <w:r>
+        <w:tab/>
+      </w:r>
+      <w:r>
+        <w:tab/>
+      </w:r>
+      <w:r>
+        <w:tab/>
+      </w:r>
+      <w:r>
+        <w:tab/>
+      </w:r>
+      <w:r>
+        <w:tab/>
+      </w:r>
+      <w:r>
+        <w:tab/>
+      </w:r>
+      <w:r>
+        <w:tab/>
+      </w:r>
+      <w:r>
+        <w:tab/>
+      </w:r>
+      <w:r>
+        <w:tab/>
+      </w:r>
+      <w:r>
+        <w:tab/>
+      </w:r>
+      <w:r>
+        <w:tab/>
+      </w:r>
+      <w:r>
+        <w:tab/>
+      </w:r>
+      <w:r>
+        <w:tab/>
+      </w:r>
+      <w:r>
+        <w:tab/>
+      </w:r>
+      <w:r>
+        <w:tab/>
+      </w:r>
+      <w:r>
+        <w:tab/>
+      </w:r>
+      <w:r>
+        <w:tab/>
+      </w:r>
+      <w:r>
+        <w:tab/>
+      </w:r>
+      <w:r>
+        <w:tab/>
+      </w:r>
+      <w:r>
+        <w:tab/>
+      </w:r>
+      <w:r>
+        <w:tab/>
+      </w:r>
+      <w:r>
+        <w:tab/>
+      </w:r>
+      <w:r>
+        <w:tab/>
+      </w:r>
+      <w:r>
+        <w:tab/>
+      </w:r>
+      <w:r>
+        <w:tab/>
+      </w:r>
+      <w:r>
+        <w:tab/>
+      </w:r>
+      <w:r>
+        <w:tab/>
+      </w:r>
+      <w:r>
+        <w:tab/>
+      </w:r>
+      <w:r>
+        <w:tab/>
+      </w:r>
+      <w:r>
+        <w:tab/>
+      </w:r>
+      <w:r>
+        <w:tab/>
+      </w:r>
+      <w:r>
+        <w:tab/>
+      </w:r>
+      <w:r>
+        <w:tab/>
+      </w:r>
+      <w:r>
+        <w:tab/>
+      </w:r>
+      <w:r>
+        <w:tab/>
+      </w:r>
+      <w:r>
+        <w:tab/>
+      </w:r>
+      <w:r>
+        <w:tab/>
+      </w:r>
+      <w:r>
+        <w:tab/>
+      </w:r>
+    </w:p>
+    <w:p>
+      <w:r>
+        <w:br w:type="page"/>
       </w:r>
     </w:p>
     <w:sectPr>

</xml_diff>